<commit_message>
docs: update embedded project report document
</commit_message>
<xml_diff>
--- a/docs/report/รายงาน embeded proj บท 1.docx
+++ b/docs/report/รายงาน embeded proj บท 1.docx
@@ -14,7 +14,11 @@
         </w:rPr>
       </w:pPr>
       <w:r>
-        <w:rPr/>
+        <w:rPr>
+          <w:rFonts w:cs="TH Sarabun New" w:ascii="TH Sarabun New" w:hAnsi="TH Sarabun New"/>
+          <w:sz w:val="32"/>
+          <w:szCs w:val="32"/>
+        </w:rPr>
         <w:drawing>
           <wp:inline distT="0" distB="0" distL="0" distR="0">
             <wp:extent cx="914400" cy="1171575"/>
@@ -1521,13 +1525,9 @@
       </w:pPr>
       <w:r>
         <w:rPr>
-          <w:rFonts w:eastAsia="TH SarabunPSK" w:cs="TH Sarabun New" w:ascii="TH Sarabun New" w:hAnsi="TH Sarabun New"/>
-          <w:b/>
-          <w:bCs/>
-          <w:color w:themeColor="text1" w:val="000000"/>
-          <w:sz w:val="32"/>
-          <w:szCs w:val="32"/>
-          <w:lang w:val="en-US"/>
+          <w:rFonts w:cs="TH Sarabun New" w:ascii="TH Sarabun New" w:hAnsi="TH Sarabun New"/>
+          <w:sz w:val="32"/>
+          <w:szCs w:val="32"/>
         </w:rPr>
       </w:r>
       <w:r>
@@ -1657,68 +1657,171 @@
       </w:pPr>
       <w:r>
         <w:rPr>
-          <w:rFonts w:ascii="TH Sarabun New" w:hAnsi="TH Sarabun New" w:eastAsia="TH SarabunPSK" w:cs="TH Sarabun New"/>
-          <w:b w:val="false"/>
-          <w:b w:val="false"/>
-          <w:bCs w:val="false"/>
-          <w:color w:themeColor="text1" w:val="000000"/>
-          <w:sz w:val="32"/>
-          <w:szCs w:val="32"/>
-          <w:lang w:val="en-US"/>
-        </w:rPr>
-        <w:t>ในปัจจุบันร้านอาหารหลายแห่งยังต้องใช้พนักงานในการนำอาหารจากครัวไปส่งยังโต๊ะลูกค้า เมื่อมีผู้ใช้บริการจำนวนมากอาจทำให้การเสิร์ฟ</w:t>
-      </w:r>
-      <w:r>
-        <w:rPr>
-          <w:rFonts w:ascii="TH Sarabun New" w:hAnsi="TH Sarabun New" w:eastAsia="TH SarabunPSK" w:cs="TH Sarabun New"/>
-          <w:b w:val="false"/>
-          <w:b w:val="false"/>
-          <w:bCs w:val="false"/>
-          <w:color w:themeColor="text1" w:val="000000"/>
-          <w:sz w:val="32"/>
-          <w:szCs w:val="32"/>
-          <w:lang w:val="en-US"/>
-        </w:rPr>
-        <w:t>อาหาร</w:t>
-      </w:r>
-      <w:r>
-        <w:rPr>
-          <w:rFonts w:ascii="TH Sarabun New" w:hAnsi="TH Sarabun New" w:eastAsia="TH SarabunPSK" w:cs="TH Sarabun New"/>
-          <w:b w:val="false"/>
-          <w:b w:val="false"/>
-          <w:bCs w:val="false"/>
-          <w:color w:themeColor="text1" w:val="000000"/>
-          <w:sz w:val="32"/>
-          <w:szCs w:val="32"/>
-          <w:lang w:val="en-US"/>
-        </w:rPr>
-        <w:t>ล่าช้า พนักงาน</w:t>
-      </w:r>
-      <w:r>
-        <w:rPr>
-          <w:rFonts w:ascii="TH Sarabun New" w:hAnsi="TH Sarabun New" w:eastAsia="TH SarabunPSK" w:cs="TH Sarabun New"/>
-          <w:b w:val="false"/>
-          <w:b w:val="false"/>
-          <w:bCs w:val="false"/>
-          <w:color w:themeColor="text1" w:val="000000"/>
-          <w:sz w:val="32"/>
-          <w:szCs w:val="32"/>
-          <w:lang w:val="en-US"/>
-        </w:rPr>
-        <w:t>เสริฟ์</w:t>
-      </w:r>
-      <w:r>
-        <w:rPr>
-          <w:rFonts w:ascii="TH Sarabun New" w:hAnsi="TH Sarabun New" w:eastAsia="TH SarabunPSK" w:cs="TH Sarabun New"/>
-          <w:b w:val="false"/>
-          <w:b w:val="false"/>
-          <w:bCs w:val="false"/>
-          <w:color w:themeColor="text1" w:val="000000"/>
-          <w:sz w:val="32"/>
-          <w:szCs w:val="32"/>
-          <w:lang w:val="en-US"/>
-        </w:rPr>
-        <w:t>เกิดความเหนื่อยล้า และมีโอกาสส่งอาหารผิดโต๊ะ นอกจากนี้ การเดินรับส่งอาหารเป็นงานที่ต้องทำซ้ำตลอดเวลา ทำให้พนักงานมีเวลาดูแลลูกค้าและจัดการงานส่วนอื่นลดลง การนำระบบอัตโนมัติเข้ามาช่วยขนส่งอาหารจึงเป็นแนวทางที่ช่วยลดภาระงานและทำให้การบริการมีความต่อเนื่องมากขึ้น</w:t>
+          <w:rFonts w:ascii="TH Sarabun New" w:hAnsi="TH Sarabun New" w:eastAsia="TH Sarabun New" w:cs="TH Sarabun New"/>
+          <w:sz w:val="32"/>
+          <w:szCs w:val="32"/>
+        </w:rPr>
+        <w:t xml:space="preserve">ธุรกิจอาหารและเครื่องดื่มเป็นภาคธุรกิจที่มีความสำคัญต่อเศรษฐกิจไทย โดยข้อมูลธุรกิจอาหารและเครื่องดื่มที่จดทะเบียนกับกรมพัฒนาธุรกิจการค้าในปี </w:t>
+      </w:r>
+      <w:r>
+        <w:rPr>
+          <w:rFonts w:eastAsia="TH Sarabun New" w:cs="TH Sarabun New" w:ascii="TH Sarabun New" w:hAnsi="TH Sarabun New"/>
+          <w:sz w:val="32"/>
+          <w:szCs w:val="32"/>
+        </w:rPr>
+        <w:t xml:space="preserve">2567 </w:t>
+      </w:r>
+      <w:r>
+        <w:rPr>
+          <w:rFonts w:ascii="TH Sarabun New" w:hAnsi="TH Sarabun New" w:eastAsia="TH Sarabun New" w:cs="TH Sarabun New"/>
+          <w:sz w:val="32"/>
+          <w:szCs w:val="32"/>
+        </w:rPr>
+        <w:t xml:space="preserve">มีรายได้รวมประมาณ </w:t>
+      </w:r>
+      <w:r>
+        <w:rPr>
+          <w:rFonts w:eastAsia="TH Sarabun New" w:cs="TH Sarabun New" w:ascii="TH Sarabun New" w:hAnsi="TH Sarabun New"/>
+          <w:sz w:val="32"/>
+          <w:szCs w:val="32"/>
+        </w:rPr>
+        <w:t xml:space="preserve">337.2 </w:t>
+      </w:r>
+      <w:r>
+        <w:rPr>
+          <w:rFonts w:ascii="TH Sarabun New" w:hAnsi="TH Sarabun New" w:eastAsia="TH Sarabun New" w:cs="TH Sarabun New"/>
+          <w:sz w:val="32"/>
+          <w:szCs w:val="32"/>
+        </w:rPr>
+        <w:t xml:space="preserve">พันล้านบาท และธุรกิจร้านอาหารมีรายได้ประมาณ </w:t>
+      </w:r>
+      <w:r>
+        <w:rPr>
+          <w:rFonts w:eastAsia="TH Sarabun New" w:cs="TH Sarabun New" w:ascii="TH Sarabun New" w:hAnsi="TH Sarabun New"/>
+          <w:sz w:val="32"/>
+          <w:szCs w:val="32"/>
+        </w:rPr>
+        <w:t xml:space="preserve">308.8 </w:t>
+      </w:r>
+      <w:r>
+        <w:rPr>
+          <w:rFonts w:ascii="TH Sarabun New" w:hAnsi="TH Sarabun New" w:eastAsia="TH Sarabun New" w:cs="TH Sarabun New"/>
+          <w:sz w:val="32"/>
+          <w:szCs w:val="32"/>
+        </w:rPr>
+        <w:t xml:space="preserve">พันล้านบาท หรือคิดเป็นร้อยละ </w:t>
+      </w:r>
+      <w:r>
+        <w:rPr>
+          <w:rFonts w:eastAsia="TH Sarabun New" w:cs="TH Sarabun New" w:ascii="TH Sarabun New" w:hAnsi="TH Sarabun New"/>
+          <w:sz w:val="32"/>
+          <w:szCs w:val="32"/>
+        </w:rPr>
+        <w:t xml:space="preserve">91.6 </w:t>
+      </w:r>
+      <w:r>
+        <w:rPr>
+          <w:rFonts w:ascii="TH Sarabun New" w:hAnsi="TH Sarabun New" w:eastAsia="TH Sarabun New" w:cs="TH Sarabun New"/>
+          <w:sz w:val="32"/>
+          <w:szCs w:val="32"/>
+        </w:rPr>
+        <w:t xml:space="preserve">ของรายได้ธุรกิจอาหารและเครื่องดื่มที่จดทะเบียนทั้งหมด </w:t>
+      </w:r>
+      <w:r>
+        <w:rPr>
+          <w:rFonts w:eastAsia="TH Sarabun New" w:cs="TH Sarabun New" w:ascii="TH Sarabun New" w:hAnsi="TH Sarabun New"/>
+          <w:sz w:val="32"/>
+          <w:szCs w:val="32"/>
+        </w:rPr>
+        <w:t xml:space="preserve">[13] </w:t>
+      </w:r>
+      <w:r>
+        <w:rPr>
+          <w:rFonts w:ascii="TH Sarabun New" w:hAnsi="TH Sarabun New" w:eastAsia="TH Sarabun New" w:cs="TH Sarabun New"/>
+          <w:sz w:val="32"/>
+          <w:szCs w:val="32"/>
+        </w:rPr>
+        <w:t xml:space="preserve">ขณะเดียวกัน สำนักงานนโยบายและยุทธศาสตร์การค้ารายงานว่า ตลาดหุ่นยนต์บริการในประเทศไทยเติบโตกว่าร้อยละ </w:t>
+      </w:r>
+      <w:r>
+        <w:rPr>
+          <w:rFonts w:eastAsia="TH Sarabun New" w:cs="TH Sarabun New" w:ascii="TH Sarabun New" w:hAnsi="TH Sarabun New"/>
+          <w:sz w:val="32"/>
+          <w:szCs w:val="32"/>
+        </w:rPr>
+        <w:t xml:space="preserve">147.8 </w:t>
+      </w:r>
+      <w:r>
+        <w:rPr>
+          <w:rFonts w:ascii="TH Sarabun New" w:hAnsi="TH Sarabun New" w:eastAsia="TH Sarabun New" w:cs="TH Sarabun New"/>
+          <w:sz w:val="32"/>
+          <w:szCs w:val="32"/>
+        </w:rPr>
+        <w:t xml:space="preserve">ในปี </w:t>
+      </w:r>
+      <w:r>
+        <w:rPr>
+          <w:rFonts w:eastAsia="TH Sarabun New" w:cs="TH Sarabun New" w:ascii="TH Sarabun New" w:hAnsi="TH Sarabun New"/>
+          <w:sz w:val="32"/>
+          <w:szCs w:val="32"/>
+        </w:rPr>
+        <w:t xml:space="preserve">2565 </w:t>
+      </w:r>
+      <w:r>
+        <w:rPr>
+          <w:rFonts w:ascii="TH Sarabun New" w:hAnsi="TH Sarabun New" w:eastAsia="TH Sarabun New" w:cs="TH Sarabun New"/>
+          <w:sz w:val="32"/>
+          <w:szCs w:val="32"/>
+        </w:rPr>
+        <w:t xml:space="preserve">มีหุ่นยนต์บริการที่ใช้งานจริงมากกว่า </w:t>
+      </w:r>
+      <w:r>
+        <w:rPr>
+          <w:rFonts w:eastAsia="TH Sarabun New" w:cs="TH Sarabun New" w:ascii="TH Sarabun New" w:hAnsi="TH Sarabun New"/>
+          <w:sz w:val="32"/>
+          <w:szCs w:val="32"/>
+        </w:rPr>
+        <w:t xml:space="preserve">1,660 </w:t>
+      </w:r>
+      <w:r>
+        <w:rPr>
+          <w:rFonts w:ascii="TH Sarabun New" w:hAnsi="TH Sarabun New" w:eastAsia="TH Sarabun New" w:cs="TH Sarabun New"/>
+          <w:sz w:val="32"/>
+          <w:szCs w:val="32"/>
+        </w:rPr>
+        <w:t xml:space="preserve">ตัว และคาดการณ์ว่าจะเพิ่มเป็น </w:t>
+      </w:r>
+      <w:r>
+        <w:rPr>
+          <w:rFonts w:eastAsia="TH Sarabun New" w:cs="TH Sarabun New" w:ascii="TH Sarabun New" w:hAnsi="TH Sarabun New"/>
+          <w:sz w:val="32"/>
+          <w:szCs w:val="32"/>
+        </w:rPr>
+        <w:t xml:space="preserve">2,270 </w:t>
+      </w:r>
+      <w:r>
+        <w:rPr>
+          <w:rFonts w:ascii="TH Sarabun New" w:hAnsi="TH Sarabun New" w:eastAsia="TH Sarabun New" w:cs="TH Sarabun New"/>
+          <w:sz w:val="32"/>
+          <w:szCs w:val="32"/>
+        </w:rPr>
+        <w:t xml:space="preserve">ตัวในปี </w:t>
+      </w:r>
+      <w:r>
+        <w:rPr>
+          <w:rFonts w:eastAsia="TH Sarabun New" w:cs="TH Sarabun New" w:ascii="TH Sarabun New" w:hAnsi="TH Sarabun New"/>
+          <w:sz w:val="32"/>
+          <w:szCs w:val="32"/>
+        </w:rPr>
+        <w:t xml:space="preserve">2567 [12] </w:t>
+      </w:r>
+      <w:r>
+        <w:rPr>
+          <w:rFonts w:ascii="TH Sarabun New" w:hAnsi="TH Sarabun New" w:eastAsia="TH Sarabun New" w:cs="TH Sarabun New"/>
+          <w:sz w:val="32"/>
+          <w:szCs w:val="32"/>
+        </w:rPr>
+        <w:t>โดยข้อมูลดังกล่าวเป็นภาพรวมของตลาดหุ่นยนต์บริการ มิใช่อัตราการใช้งานเฉพาะในร้านอาหาร ตัวเลขเหล่านี้สะท้อนให้เห็นถึงขนาดของอุตสาหกรรมอาหารและแนวโน้มการประยุกต์ใช้เทคโนโลยีเพื่อสนับสนุนการให้บริการ อย่างไรก็ตาม จากการศึกษายังพบปัญหาการบริการในร้านอาหารขนาดเล็กได้ เช่น การนำอาหารจากครัวไปส่งยังโต๊ะลูกค้ายังคงเป็นงานที่ต้องทำซ้ำและอาจเกิดความล่าช้าหรือความผิดพลาดได้ โดยเฉพาะในช่วงที่มีผู้ใช้บริการจำนวนมาก จึงมีความสนใจในการนำระบบอัตโนมัติมาช่วยสนับสนุนการขนส่งอาหารภายในร้าน</w:t>
       </w:r>
     </w:p>
     <w:p>
@@ -1736,191 +1839,43 @@
       </w:pPr>
       <w:r>
         <w:rPr>
-          <w:rFonts w:ascii="TH Sarabun New" w:hAnsi="TH Sarabun New" w:eastAsia="TH SarabunPSK" w:cs="TH Sarabun New"/>
-          <w:b w:val="false"/>
-          <w:b w:val="false"/>
-          <w:bCs w:val="false"/>
-          <w:color w:themeColor="text1" w:val="000000"/>
-          <w:sz w:val="32"/>
-          <w:szCs w:val="32"/>
-          <w:lang w:val="en-US"/>
-        </w:rPr>
-        <w:t xml:space="preserve">คณะผู้จัดทำจึงพัฒนาหุ่นยนต์ส่งอาหารอัตโนมัติ </w:t>
-      </w:r>
-      <w:r>
-        <w:rPr>
-          <w:rFonts w:eastAsia="TH SarabunPSK" w:cs="TH Sarabun New" w:ascii="TH Sarabun New" w:hAnsi="TH Sarabun New"/>
-          <w:b w:val="false"/>
-          <w:bCs w:val="false"/>
-          <w:color w:themeColor="text1" w:val="000000"/>
-          <w:sz w:val="32"/>
-          <w:szCs w:val="32"/>
-          <w:lang w:val="en-US"/>
-        </w:rPr>
-        <w:t xml:space="preserve">(Food Delivery Robot) </w:t>
-      </w:r>
-      <w:r>
-        <w:rPr>
-          <w:rFonts w:ascii="TH Sarabun New" w:hAnsi="TH Sarabun New" w:eastAsia="TH SarabunPSK" w:cs="TH Sarabun New"/>
-          <w:b w:val="false"/>
-          <w:b w:val="false"/>
-          <w:bCs w:val="false"/>
-          <w:color w:themeColor="text1" w:val="000000"/>
-          <w:sz w:val="32"/>
-          <w:szCs w:val="32"/>
-          <w:lang w:val="en-US"/>
-        </w:rPr>
-        <w:t xml:space="preserve">ให้พนักงานเลือกชั้นวางและโต๊ะปลายทางผ่านหน้าจอ </w:t>
-      </w:r>
-      <w:r>
-        <w:rPr>
-          <w:rFonts w:eastAsia="TH SarabunPSK" w:cs="TH Sarabun New" w:ascii="TH Sarabun New" w:hAnsi="TH Sarabun New"/>
-          <w:b w:val="false"/>
-          <w:bCs w:val="false"/>
-          <w:color w:themeColor="text1" w:val="000000"/>
-          <w:sz w:val="32"/>
-          <w:szCs w:val="32"/>
-          <w:lang w:val="en-US"/>
-        </w:rPr>
-        <w:t xml:space="preserve">POS </w:t>
-      </w:r>
-      <w:r>
-        <w:rPr>
-          <w:rFonts w:ascii="TH Sarabun New" w:hAnsi="TH Sarabun New" w:eastAsia="TH SarabunPSK" w:cs="TH Sarabun New"/>
-          <w:b w:val="false"/>
-          <w:b w:val="false"/>
-          <w:bCs w:val="false"/>
-          <w:color w:themeColor="text1" w:val="000000"/>
-          <w:sz w:val="32"/>
-          <w:szCs w:val="32"/>
-          <w:lang w:val="en-US"/>
-        </w:rPr>
-        <w:t xml:space="preserve">หรือ </w:t>
-      </w:r>
-      <w:r>
-        <w:rPr>
-          <w:rFonts w:eastAsia="TH SarabunPSK" w:cs="TH Sarabun New" w:ascii="TH Sarabun New" w:hAnsi="TH Sarabun New"/>
-          <w:b w:val="false"/>
-          <w:bCs w:val="false"/>
-          <w:color w:themeColor="text1" w:val="000000"/>
-          <w:sz w:val="32"/>
-          <w:szCs w:val="32"/>
-          <w:lang w:val="en-US"/>
-        </w:rPr>
-        <w:t xml:space="preserve">Keypad 4×4 </w:t>
-      </w:r>
-      <w:r>
-        <w:rPr>
-          <w:rFonts w:ascii="TH Sarabun New" w:hAnsi="TH Sarabun New" w:eastAsia="TH SarabunPSK" w:cs="TH Sarabun New"/>
-          <w:b w:val="false"/>
-          <w:b w:val="false"/>
-          <w:bCs w:val="false"/>
-          <w:color w:themeColor="text1" w:val="000000"/>
-          <w:sz w:val="32"/>
-          <w:szCs w:val="32"/>
-          <w:lang w:val="en-US"/>
-        </w:rPr>
-        <w:t xml:space="preserve">ที่เชื่อมกับ </w:t>
-      </w:r>
-      <w:r>
-        <w:rPr>
-          <w:rFonts w:eastAsia="TH SarabunPSK" w:cs="TH Sarabun New" w:ascii="TH Sarabun New" w:hAnsi="TH Sarabun New"/>
-          <w:b w:val="false"/>
-          <w:bCs w:val="false"/>
-          <w:color w:themeColor="text1" w:val="000000"/>
-          <w:sz w:val="32"/>
-          <w:szCs w:val="32"/>
-          <w:lang w:val="en-US"/>
-        </w:rPr>
-        <w:t xml:space="preserve">Arduino Uno </w:t>
-      </w:r>
-      <w:r>
-        <w:rPr>
-          <w:rFonts w:ascii="TH Sarabun New" w:hAnsi="TH Sarabun New" w:eastAsia="TH SarabunPSK" w:cs="TH Sarabun New"/>
-          <w:b w:val="false"/>
-          <w:b w:val="false"/>
-          <w:bCs w:val="false"/>
-          <w:color w:themeColor="text1" w:val="000000"/>
-          <w:sz w:val="32"/>
-          <w:szCs w:val="32"/>
-          <w:lang w:val="en-US"/>
-        </w:rPr>
-        <w:t xml:space="preserve">ระบบจัดลำดับการส่ง เคลื่อนที่ไปยังโต๊ะ และกลับจุดบริการเมื่อส่งครบ เมื่อถึงโต๊ะผู้ใช้ยืนยันการรับอาหารผ่าน </w:t>
-      </w:r>
-      <w:r>
-        <w:rPr>
-          <w:rFonts w:eastAsia="TH SarabunPSK" w:cs="TH Sarabun New" w:ascii="TH Sarabun New" w:hAnsi="TH Sarabun New"/>
-          <w:b w:val="false"/>
-          <w:bCs w:val="false"/>
-          <w:color w:themeColor="text1" w:val="000000"/>
-          <w:sz w:val="32"/>
-          <w:szCs w:val="32"/>
-          <w:lang w:val="en-US"/>
-        </w:rPr>
-        <w:t xml:space="preserve">POS </w:t>
-      </w:r>
-      <w:r>
-        <w:rPr>
-          <w:rFonts w:ascii="TH Sarabun New" w:hAnsi="TH Sarabun New" w:eastAsia="TH SarabunPSK" w:cs="TH Sarabun New"/>
-          <w:b w:val="false"/>
-          <w:b w:val="false"/>
-          <w:bCs w:val="false"/>
-          <w:color w:themeColor="text1" w:val="000000"/>
-          <w:sz w:val="32"/>
-          <w:szCs w:val="32"/>
-          <w:lang w:val="en-US"/>
-        </w:rPr>
-        <w:t xml:space="preserve">หรือ </w:t>
-      </w:r>
-      <w:r>
-        <w:rPr>
-          <w:rFonts w:eastAsia="TH SarabunPSK" w:cs="TH Sarabun New" w:ascii="TH Sarabun New" w:hAnsi="TH Sarabun New"/>
-          <w:b w:val="false"/>
-          <w:bCs w:val="false"/>
-          <w:color w:themeColor="text1" w:val="000000"/>
-          <w:sz w:val="32"/>
-          <w:szCs w:val="32"/>
-          <w:lang w:val="en-US"/>
-        </w:rPr>
-        <w:t xml:space="preserve">Keypad </w:t>
-      </w:r>
-      <w:r>
-        <w:rPr>
-          <w:rFonts w:ascii="TH Sarabun New" w:hAnsi="TH Sarabun New" w:eastAsia="TH SarabunPSK" w:cs="TH Sarabun New"/>
-          <w:b w:val="false"/>
-          <w:b w:val="false"/>
-          <w:bCs w:val="false"/>
-          <w:color w:themeColor="text1" w:val="000000"/>
-          <w:sz w:val="32"/>
-          <w:szCs w:val="32"/>
-          <w:lang w:val="en-US"/>
-        </w:rPr>
-        <w:t xml:space="preserve">หุ่นยนต์หยุดรอชั่วคราวเมื่อ </w:t>
-      </w:r>
-      <w:r>
-        <w:rPr>
-          <w:rFonts w:eastAsia="TH SarabunPSK" w:cs="TH Sarabun New" w:ascii="TH Sarabun New" w:hAnsi="TH Sarabun New"/>
-          <w:b w:val="false"/>
-          <w:bCs w:val="false"/>
-          <w:color w:themeColor="text1" w:val="000000"/>
-          <w:sz w:val="32"/>
-          <w:szCs w:val="32"/>
-          <w:lang w:val="en-US"/>
-        </w:rPr>
-        <w:t xml:space="preserve">LiDAR </w:t>
-      </w:r>
-      <w:r>
-        <w:rPr>
-          <w:rFonts w:ascii="TH Sarabun New" w:hAnsi="TH Sarabun New" w:eastAsia="TH SarabunPSK" w:cs="TH Sarabun New"/>
-          <w:b w:val="false"/>
-          <w:b w:val="false"/>
-          <w:bCs w:val="false"/>
-          <w:color w:themeColor="text1" w:val="000000"/>
-          <w:sz w:val="32"/>
-          <w:szCs w:val="32"/>
-          <w:lang w:val="en-US"/>
-        </w:rPr>
-        <w:t>พบสิ่งกีดขวางด้านหน้า และแสดงคำเตือนบนหน้าจอ</w:t>
+          <w:rFonts w:ascii="TH Sarabun New" w:hAnsi="TH Sarabun New" w:eastAsia="TH Sarabun New" w:cs="TH Sarabun New"/>
+          <w:sz w:val="32"/>
+          <w:szCs w:val="32"/>
+        </w:rPr>
+        <w:t xml:space="preserve">ระบบสมองกลฝังตัว </w:t>
+      </w:r>
+      <w:r>
+        <w:rPr>
+          <w:rFonts w:eastAsia="TH Sarabun New" w:cs="TH Sarabun New" w:ascii="TH Sarabun New" w:hAnsi="TH Sarabun New"/>
+          <w:sz w:val="32"/>
+          <w:szCs w:val="32"/>
+        </w:rPr>
+        <w:t xml:space="preserve">(Embedded System) </w:t>
+      </w:r>
+      <w:r>
+        <w:rPr>
+          <w:rFonts w:ascii="TH Sarabun New" w:hAnsi="TH Sarabun New" w:eastAsia="TH Sarabun New" w:cs="TH Sarabun New"/>
+          <w:sz w:val="32"/>
+          <w:szCs w:val="32"/>
+        </w:rPr>
+        <w:t xml:space="preserve">และระบบอัตโนมัติ </w:t>
+      </w:r>
+      <w:r>
+        <w:rPr>
+          <w:rFonts w:eastAsia="TH Sarabun New" w:cs="TH Sarabun New" w:ascii="TH Sarabun New" w:hAnsi="TH Sarabun New"/>
+          <w:sz w:val="32"/>
+          <w:szCs w:val="32"/>
+        </w:rPr>
+        <w:t xml:space="preserve">(Automation) </w:t>
+      </w:r>
+      <w:r>
+        <w:rPr>
+          <w:rFonts w:ascii="TH Sarabun New" w:hAnsi="TH Sarabun New" w:eastAsia="TH Sarabun New" w:cs="TH Sarabun New"/>
+          <w:sz w:val="32"/>
+          <w:szCs w:val="32"/>
+        </w:rPr>
+        <w:t>มีบทบาทสำคัญต่อการดำเนินชีวิตและการพัฒนาเศรษฐกิจในสังคมปัจจุบัน ระบบสมองกลฝังตัวช่วยให้อุปกรณ์ต่าง ๆ สามารถรับข้อมูลจากสภาพแวดล้อม ประมวลผลข้อมูล และตอบสนองตามเงื่อนไขที่กำหนดได้อย่างเหมาะสม ขณะที่ระบบอัตโนมัติช่วยลดขั้นตอนการทำงานที่ซ้ำซ้อน เพิ่มความสม่ำเสมอในการปฏิบัติงาน และสนับสนุนการทำงานที่ต้องการความรวดเร็วหรือความต่อเนื่อง เทคโนโลยีทั้งสองจึงถูกนำไปประยุกต์ใช้ในหลายด้าน เช่น อุตสาหกรรม การแพทย์ การคมนาคม เกษตรกรรม บ้านอัจฉริยะ และธุรกิจบริการ นอกจากช่วยเพิ่มประสิทธิภาพของกระบวนการทำงานแล้ว ยังช่วยให้มนุษย์สามารถมุ่งเน้นงานที่ต้องใช้การตัดสินใจ การดูแลผู้รับบริการ และความคิดสร้างสรรค์ได้มากขึ้น การออกแบบระบบดังกล่าวจึงควรคำนึงถึงความถูกต้อง ความปลอดภัย ความน่าเชื่อถือ ต้นทุน และความเหมาะสมกับบริบทการใช้งาน</w:t>
       </w:r>
     </w:p>
     <w:p>
@@ -1938,203 +1893,27 @@
       </w:pPr>
       <w:r>
         <w:rPr>
-          <w:rFonts w:eastAsia="TH SarabunPSK" w:cs="TH Sarabun New" w:ascii="TH Sarabun New" w:hAnsi="TH Sarabun New"/>
-          <w:b w:val="false"/>
-          <w:bCs w:val="false"/>
-          <w:color w:themeColor="text1" w:val="000000"/>
-          <w:sz w:val="32"/>
-          <w:szCs w:val="32"/>
-          <w:lang w:val="en-US"/>
-        </w:rPr>
-        <w:t xml:space="preserve">Raspberry Pi </w:t>
-      </w:r>
-      <w:r>
-        <w:rPr>
-          <w:rFonts w:ascii="TH Sarabun New" w:hAnsi="TH Sarabun New" w:eastAsia="TH SarabunPSK" w:cs="TH Sarabun New"/>
-          <w:b w:val="false"/>
-          <w:b w:val="false"/>
-          <w:bCs w:val="false"/>
-          <w:color w:themeColor="text1" w:val="000000"/>
-          <w:sz w:val="32"/>
-          <w:szCs w:val="32"/>
-          <w:lang w:val="en-US"/>
-        </w:rPr>
-        <w:t xml:space="preserve">ควบคุมลำดับภารกิจและทำงานร่วมกับ </w:t>
-      </w:r>
-      <w:r>
-        <w:rPr>
-          <w:rFonts w:eastAsia="TH SarabunPSK" w:cs="TH Sarabun New" w:ascii="TH Sarabun New" w:hAnsi="TH Sarabun New"/>
-          <w:b w:val="false"/>
-          <w:bCs w:val="false"/>
-          <w:color w:themeColor="text1" w:val="000000"/>
-          <w:sz w:val="32"/>
-          <w:szCs w:val="32"/>
-          <w:lang w:val="en-US"/>
-        </w:rPr>
-        <w:t xml:space="preserve">ROS 2, LiDAR </w:t>
-      </w:r>
-      <w:r>
-        <w:rPr>
-          <w:rFonts w:ascii="TH Sarabun New" w:hAnsi="TH Sarabun New" w:eastAsia="TH SarabunPSK" w:cs="TH Sarabun New"/>
-          <w:b w:val="false"/>
-          <w:b w:val="false"/>
-          <w:bCs w:val="false"/>
-          <w:color w:themeColor="text1" w:val="000000"/>
-          <w:sz w:val="32"/>
-          <w:szCs w:val="32"/>
-          <w:lang w:val="en-US"/>
-        </w:rPr>
-        <w:t xml:space="preserve">และ </w:t>
-      </w:r>
-      <w:r>
-        <w:rPr>
-          <w:rFonts w:eastAsia="TH SarabunPSK" w:cs="TH Sarabun New" w:ascii="TH Sarabun New" w:hAnsi="TH Sarabun New"/>
-          <w:b w:val="false"/>
-          <w:bCs w:val="false"/>
-          <w:color w:themeColor="text1" w:val="000000"/>
-          <w:sz w:val="32"/>
-          <w:szCs w:val="32"/>
-          <w:lang w:val="en-US"/>
-        </w:rPr>
-        <w:t xml:space="preserve">SLAM </w:t>
-      </w:r>
-      <w:r>
-        <w:rPr>
-          <w:rFonts w:ascii="TH Sarabun New" w:hAnsi="TH Sarabun New" w:eastAsia="TH SarabunPSK" w:cs="TH Sarabun New"/>
-          <w:b w:val="false"/>
-          <w:b w:val="false"/>
-          <w:bCs w:val="false"/>
-          <w:color w:themeColor="text1" w:val="000000"/>
-          <w:sz w:val="32"/>
-          <w:szCs w:val="32"/>
-          <w:lang w:val="en-US"/>
-        </w:rPr>
-        <w:t xml:space="preserve">ส่วน </w:t>
-      </w:r>
-      <w:r>
-        <w:rPr>
-          <w:rFonts w:eastAsia="TH SarabunPSK" w:cs="TH Sarabun New" w:ascii="TH Sarabun New" w:hAnsi="TH Sarabun New"/>
-          <w:b w:val="false"/>
-          <w:bCs w:val="false"/>
-          <w:color w:themeColor="text1" w:val="000000"/>
-          <w:sz w:val="32"/>
-          <w:szCs w:val="32"/>
-          <w:lang w:val="en-US"/>
-        </w:rPr>
-        <w:t xml:space="preserve">Arduino Uno </w:t>
-      </w:r>
-      <w:r>
-        <w:rPr>
-          <w:rFonts w:ascii="TH Sarabun New" w:hAnsi="TH Sarabun New" w:eastAsia="TH SarabunPSK" w:cs="TH Sarabun New"/>
-          <w:b w:val="false"/>
-          <w:b w:val="false"/>
-          <w:bCs w:val="false"/>
-          <w:color w:themeColor="text1" w:val="000000"/>
-          <w:sz w:val="32"/>
-          <w:szCs w:val="32"/>
-          <w:lang w:val="en-US"/>
-        </w:rPr>
-        <w:t xml:space="preserve">ควบคุมมอเตอร์ อ่าน </w:t>
-      </w:r>
-      <w:r>
-        <w:rPr>
-          <w:rFonts w:eastAsia="TH SarabunPSK" w:cs="TH Sarabun New" w:ascii="TH Sarabun New" w:hAnsi="TH Sarabun New"/>
-          <w:b w:val="false"/>
-          <w:bCs w:val="false"/>
-          <w:color w:themeColor="text1" w:val="000000"/>
-          <w:sz w:val="32"/>
-          <w:szCs w:val="32"/>
-          <w:lang w:val="en-US"/>
-        </w:rPr>
-        <w:t xml:space="preserve">Encoder </w:t>
-      </w:r>
-      <w:r>
-        <w:rPr>
-          <w:rFonts w:ascii="TH Sarabun New" w:hAnsi="TH Sarabun New" w:eastAsia="TH SarabunPSK" w:cs="TH Sarabun New"/>
-          <w:b w:val="false"/>
-          <w:b w:val="false"/>
-          <w:bCs w:val="false"/>
-          <w:color w:themeColor="text1" w:val="000000"/>
-          <w:sz w:val="32"/>
-          <w:szCs w:val="32"/>
-          <w:lang w:val="en-US"/>
-        </w:rPr>
-        <w:t xml:space="preserve">อ่าน </w:t>
-      </w:r>
-      <w:r>
-        <w:rPr>
-          <w:rFonts w:eastAsia="TH SarabunPSK" w:cs="TH Sarabun New" w:ascii="TH Sarabun New" w:hAnsi="TH Sarabun New"/>
-          <w:b w:val="false"/>
-          <w:bCs w:val="false"/>
-          <w:color w:themeColor="text1" w:val="000000"/>
-          <w:sz w:val="32"/>
-          <w:szCs w:val="32"/>
-          <w:lang w:val="en-US"/>
-        </w:rPr>
-        <w:t xml:space="preserve">Keypad </w:t>
-      </w:r>
-      <w:r>
-        <w:rPr>
-          <w:rFonts w:ascii="TH Sarabun New" w:hAnsi="TH Sarabun New" w:eastAsia="TH SarabunPSK" w:cs="TH Sarabun New"/>
-          <w:b w:val="false"/>
-          <w:b w:val="false"/>
-          <w:bCs w:val="false"/>
-          <w:color w:themeColor="text1" w:val="000000"/>
-          <w:sz w:val="32"/>
-          <w:szCs w:val="32"/>
-          <w:lang w:val="en-US"/>
-        </w:rPr>
-        <w:t xml:space="preserve">ผ่าน </w:t>
-      </w:r>
-      <w:r>
-        <w:rPr>
-          <w:rFonts w:eastAsia="TH SarabunPSK" w:cs="TH Sarabun New" w:ascii="TH Sarabun New" w:hAnsi="TH Sarabun New"/>
-          <w:b w:val="false"/>
-          <w:bCs w:val="false"/>
-          <w:color w:themeColor="text1" w:val="000000"/>
-          <w:sz w:val="32"/>
-          <w:szCs w:val="32"/>
-          <w:lang w:val="en-US"/>
-        </w:rPr>
-        <w:t xml:space="preserve">PCF8574 </w:t>
-      </w:r>
-      <w:r>
-        <w:rPr>
-          <w:rFonts w:ascii="TH Sarabun New" w:hAnsi="TH Sarabun New" w:eastAsia="TH SarabunPSK" w:cs="TH Sarabun New"/>
-          <w:b w:val="false"/>
-          <w:b w:val="false"/>
-          <w:bCs w:val="false"/>
-          <w:color w:themeColor="text1" w:val="000000"/>
-          <w:sz w:val="32"/>
-          <w:szCs w:val="32"/>
-          <w:lang w:val="en-US"/>
-        </w:rPr>
-        <w:t xml:space="preserve">และขับ </w:t>
-      </w:r>
-      <w:r>
-        <w:rPr>
-          <w:rFonts w:eastAsia="TH SarabunPSK" w:cs="TH Sarabun New" w:ascii="TH Sarabun New" w:hAnsi="TH Sarabun New"/>
-          <w:b w:val="false"/>
-          <w:bCs w:val="false"/>
-          <w:color w:themeColor="text1" w:val="000000"/>
-          <w:sz w:val="32"/>
-          <w:szCs w:val="32"/>
-          <w:lang w:val="en-US"/>
-        </w:rPr>
-        <w:t xml:space="preserve">Dot Matrix MAX7219 </w:t>
-      </w:r>
-      <w:r>
-        <w:rPr>
-          <w:rFonts w:ascii="TH Sarabun New" w:hAnsi="TH Sarabun New" w:eastAsia="TH SarabunPSK" w:cs="TH Sarabun New"/>
-          <w:b w:val="false"/>
-          <w:b w:val="false"/>
-          <w:bCs w:val="false"/>
-          <w:color w:themeColor="text1" w:val="000000"/>
-          <w:sz w:val="32"/>
-          <w:szCs w:val="32"/>
-          <w:lang w:val="en-US"/>
-        </w:rPr>
-        <w:t>เพื่อแสดงทิศทางขณะเลี้ยวในภารกิจส่งอาหาร การพัฒนานี้ประยุกต์ความรู้ด้านระบบสมองกลฝังตัว การสื่อสารระหว่างอุปกรณ์ การควบคุมแบบป้อนกลับ และส่วนติดต่อผู้ใช้ โดยมุ่งลดงานซ้ำและความผิดพลาดในการส่งอาหาร</w:t>
+          <w:rFonts w:ascii="TH Sarabun New" w:hAnsi="TH Sarabun New" w:eastAsia="TH Sarabun New" w:cs="TH Sarabun New"/>
+          <w:sz w:val="32"/>
+          <w:szCs w:val="32"/>
+        </w:rPr>
+        <w:t xml:space="preserve">จากความสำคัญของปัญหาและบทบาทของเทคโนโลยีดังกล่าว คณะผู้จัดทำจึงสนใจพัฒนาต้นแบบหุ่นยนต์ส่งอาหารอัตโนมัติสำหรับช่วยลำเลียงอาหารภายในพื้นที่จำลอง โดยมุ่งประยุกต์ใช้ความรู้ในขอบเขตของวิชา </w:t>
+      </w:r>
+      <w:r>
+        <w:rPr>
+          <w:rFonts w:eastAsia="TH Sarabun New" w:cs="TH Sarabun New" w:ascii="TH Sarabun New" w:hAnsi="TH Sarabun New"/>
+          <w:sz w:val="32"/>
+          <w:szCs w:val="32"/>
+        </w:rPr>
+        <w:t xml:space="preserve">Embedded System Developer Module </w:t>
+      </w:r>
+      <w:r>
+        <w:rPr>
+          <w:rFonts w:ascii="TH Sarabun New" w:hAnsi="TH Sarabun New" w:eastAsia="TH Sarabun New" w:cs="TH Sarabun New"/>
+          <w:sz w:val="32"/>
+          <w:szCs w:val="32"/>
+        </w:rPr>
+        <w:t>ได้แก่ ระบบสมองกลฝังตัว การควบคุมอุปกรณ์ การสื่อสารระหว่างระบบ การตรวจจับสภาพแวดล้อม และการนำทางอัตโนมัติ โครงงานนี้จึงเป็นแนวทางสำหรับศึกษาและบูรณาการเทคโนโลยีที่เกี่ยวข้องกับการพัฒนาระบบอัตโนมัติในงานบริการ ทั้งนี้ ผลงานมีลักษณะเป็นต้นแบบเพื่อการเรียนรู้และการทดสอบในพื้นที่จำลอง ยังไม่ครอบคลุมการใช้งานจริงเชิงพาณิชย์</w:t>
       </w:r>
     </w:p>
     <w:p>
@@ -2180,6 +1959,56 @@
       <w:r>
         <w:rPr>
           <w:rFonts w:eastAsia="TH SarabunPSK" w:cs="TH Sarabun New" w:ascii="TH Sarabun New" w:hAnsi="TH Sarabun New"/>
+          <w:b/>
+          <w:bCs/>
+          <w:color w:themeColor="text1" w:val="000000"/>
+          <w:sz w:val="32"/>
+          <w:szCs w:val="32"/>
+          <w:lang w:val="en-US"/>
+        </w:rPr>
+        <w:t xml:space="preserve">1.2 </w:t>
+      </w:r>
+      <w:r>
+        <w:rPr>
+          <w:rFonts w:ascii="TH Sarabun New" w:hAnsi="TH Sarabun New" w:eastAsia="TH SarabunPSK" w:cs="TH Sarabun New"/>
+          <w:b/>
+          <w:b/>
+          <w:bCs/>
+          <w:color w:themeColor="text1" w:val="000000"/>
+          <w:sz w:val="32"/>
+          <w:szCs w:val="32"/>
+          <w:lang w:val="en-US"/>
+        </w:rPr>
+        <w:t>วัตถุประสงค์</w:t>
+      </w:r>
+    </w:p>
+    <w:p>
+      <w:pPr>
+        <w:pStyle w:val="Normal"/>
+        <w:bidi w:val="0"/>
+        <w:spacing w:lineRule="auto" w:line="240" w:beforeAutospacing="0" w:before="0" w:afterAutospacing="0" w:after="200"/>
+        <w:rPr>
+          <w:rFonts w:ascii="TH Sarabun New" w:hAnsi="TH Sarabun New" w:cs="TH Sarabun New"/>
+          <w:sz w:val="32"/>
+          <w:szCs w:val="32"/>
+        </w:rPr>
+      </w:pPr>
+      <w:r>
+        <w:rPr>
+          <w:rFonts w:eastAsia="TH SarabunPSK" w:cs="TH Sarabun New" w:ascii="TH Sarabun New" w:hAnsi="TH Sarabun New"/>
+          <w:b/>
+          <w:bCs/>
+          <w:color w:themeColor="text1" w:val="000000"/>
+          <w:sz w:val="32"/>
+          <w:szCs w:val="32"/>
+          <w:lang w:val="en-US"/>
+        </w:rPr>
+        <w:tab/>
+      </w:r>
+      <w:r>
+        <w:rPr>
+          <w:rFonts w:ascii="TH Sarabun New" w:hAnsi="TH Sarabun New" w:eastAsia="TH SarabunPSK" w:cs="TH Sarabun New"/>
+          <w:b w:val="false"/>
           <w:b w:val="false"/>
           <w:bCs w:val="false"/>
           <w:color w:themeColor="text1" w:val="000000"/>
@@ -2187,12 +2016,11 @@
           <w:szCs w:val="32"/>
           <w:lang w:val="en-US"/>
         </w:rPr>
-        <w:t xml:space="preserve">1.2 </w:t>
-      </w:r>
-      <w:r>
-        <w:rPr>
-          <w:rFonts w:ascii="TH Sarabun New" w:hAnsi="TH Sarabun New" w:eastAsia="TH SarabunPSK" w:cs="TH Sarabun New"/>
-          <w:b w:val="false"/>
+        <w:t xml:space="preserve">เพื่อศึกษาการประยุกต์ใช้ความรู้จากวิชา </w:t>
+      </w:r>
+      <w:r>
+        <w:rPr>
+          <w:rFonts w:eastAsia="TH SarabunPSK" w:cs="TH Sarabun New" w:ascii="TH Sarabun New" w:hAnsi="TH Sarabun New"/>
           <w:b w:val="false"/>
           <w:bCs w:val="false"/>
           <w:color w:themeColor="text1" w:val="000000"/>
@@ -2200,7 +2028,57 @@
           <w:szCs w:val="32"/>
           <w:lang w:val="en-US"/>
         </w:rPr>
-        <w:t>วัตถุประสงค์</w:t>
+        <w:t xml:space="preserve">240-319 </w:t>
+      </w:r>
+      <w:r>
+        <w:rPr>
+          <w:rFonts w:eastAsia="TH Sarabun New" w:cs="TH Sarabun New" w:ascii="TH Sarabun New" w:hAnsi="TH Sarabun New"/>
+          <w:b w:val="false"/>
+          <w:bCs w:val="false"/>
+          <w:color w:themeColor="text1" w:val="000000"/>
+          <w:sz w:val="32"/>
+          <w:szCs w:val="32"/>
+          <w:lang w:val="en-US"/>
+        </w:rPr>
+        <w:t xml:space="preserve">Embedded System Developer Module </w:t>
+      </w:r>
+      <w:r>
+        <w:rPr>
+          <w:rFonts w:ascii="TH Sarabun New" w:hAnsi="TH Sarabun New" w:eastAsia="TH Sarabun New" w:cs="TH Sarabun New"/>
+          <w:b w:val="false"/>
+          <w:b w:val="false"/>
+          <w:bCs w:val="false"/>
+          <w:color w:themeColor="text1" w:val="000000"/>
+          <w:sz w:val="32"/>
+          <w:szCs w:val="32"/>
+          <w:lang w:val="en-US"/>
+        </w:rPr>
+        <w:t xml:space="preserve">มาสร้างต้นแบบหุ่นยนต์ส่งอาหาร </w:t>
+      </w:r>
+      <w:r>
+        <w:rPr>
+          <w:rFonts w:eastAsia="TH Sarabun New" w:cs="TH Sarabun New" w:ascii="TH Sarabun New" w:hAnsi="TH Sarabun New"/>
+          <w:b w:val="false"/>
+          <w:bCs w:val="false"/>
+          <w:color w:themeColor="text1" w:val="000000"/>
+          <w:sz w:val="32"/>
+          <w:szCs w:val="32"/>
+          <w:lang w:val="en-US"/>
+        </w:rPr>
+        <w:t xml:space="preserve">(Food Delivery Robot) </w:t>
+      </w:r>
+      <w:r>
+        <w:rPr>
+          <w:rFonts w:ascii="TH Sarabun New" w:hAnsi="TH Sarabun New" w:eastAsia="TH Sarabun New" w:cs="TH Sarabun New"/>
+          <w:b w:val="false"/>
+          <w:b w:val="false"/>
+          <w:bCs w:val="false"/>
+          <w:color w:themeColor="text1" w:val="000000"/>
+          <w:sz w:val="32"/>
+          <w:szCs w:val="32"/>
+          <w:lang w:val="en-US"/>
+        </w:rPr>
+        <w:t>สำหรับร้านอาหารขนาดเล็ก</w:t>
       </w:r>
     </w:p>
     <w:p>
@@ -2211,208 +2089,6 @@
         <w:ind w:firstLine="720"/>
         <w:jc w:val="both"/>
         <w:rPr>
-          <w:rFonts w:ascii="TH Sarabun New" w:hAnsi="TH Sarabun New" w:cs="TH Sarabun New"/>
-          <w:sz w:val="32"/>
-          <w:szCs w:val="32"/>
-        </w:rPr>
-      </w:pPr>
-      <w:r>
-        <w:rPr>
-          <w:rFonts w:ascii="TH Sarabun New" w:hAnsi="TH Sarabun New" w:eastAsia="TH SarabunPSK" w:cs="TH Sarabun New"/>
-          <w:b w:val="false"/>
-          <w:b w:val="false"/>
-          <w:bCs w:val="false"/>
-          <w:color w:themeColor="text1" w:val="000000"/>
-          <w:sz w:val="32"/>
-          <w:szCs w:val="32"/>
-          <w:lang w:val="en-US"/>
-        </w:rPr>
-        <w:t xml:space="preserve">การพัฒนาระบบหุ่นยนต์ส่งอาหารอัตโนมัติ </w:t>
-      </w:r>
-      <w:r>
-        <w:rPr>
-          <w:rFonts w:eastAsia="TH SarabunPSK" w:cs="TH Sarabun New" w:ascii="TH Sarabun New" w:hAnsi="TH Sarabun New"/>
-          <w:b w:val="false"/>
-          <w:bCs w:val="false"/>
-          <w:color w:themeColor="text1" w:val="000000"/>
-          <w:sz w:val="32"/>
-          <w:szCs w:val="32"/>
-          <w:lang w:val="en-US"/>
-        </w:rPr>
-        <w:t xml:space="preserve">(Food Delivery Robot) </w:t>
-      </w:r>
-      <w:r>
-        <w:rPr>
-          <w:rFonts w:ascii="TH Sarabun New" w:hAnsi="TH Sarabun New" w:eastAsia="TH SarabunPSK" w:cs="TH Sarabun New"/>
-          <w:b w:val="false"/>
-          <w:b w:val="false"/>
-          <w:bCs w:val="false"/>
-          <w:color w:themeColor="text1" w:val="000000"/>
-          <w:sz w:val="32"/>
-          <w:szCs w:val="32"/>
-          <w:lang w:val="en-US"/>
-        </w:rPr>
-        <w:t xml:space="preserve">มีวัตถุประสงค์เพื่อให้หุ่นยนต์รับรายการจากระบบ </w:t>
-      </w:r>
-      <w:r>
-        <w:rPr>
-          <w:rFonts w:eastAsia="TH SarabunPSK" w:cs="TH Sarabun New" w:ascii="TH Sarabun New" w:hAnsi="TH Sarabun New"/>
-          <w:b w:val="false"/>
-          <w:bCs w:val="false"/>
-          <w:color w:themeColor="text1" w:val="000000"/>
-          <w:sz w:val="32"/>
-          <w:szCs w:val="32"/>
-          <w:lang w:val="en-US"/>
-        </w:rPr>
-        <w:t xml:space="preserve">POS </w:t>
-      </w:r>
-      <w:r>
-        <w:rPr>
-          <w:rFonts w:ascii="TH Sarabun New" w:hAnsi="TH Sarabun New" w:eastAsia="TH SarabunPSK" w:cs="TH Sarabun New"/>
-          <w:b w:val="false"/>
-          <w:b w:val="false"/>
-          <w:bCs w:val="false"/>
-          <w:color w:themeColor="text1" w:val="000000"/>
-          <w:sz w:val="32"/>
-          <w:szCs w:val="32"/>
-          <w:lang w:val="en-US"/>
-        </w:rPr>
-        <w:t xml:space="preserve">ผ่านหน้าจอสัมผัสหรือ </w:t>
-      </w:r>
-      <w:r>
-        <w:rPr>
-          <w:rFonts w:eastAsia="TH SarabunPSK" w:cs="TH Sarabun New" w:ascii="TH Sarabun New" w:hAnsi="TH Sarabun New"/>
-          <w:b w:val="false"/>
-          <w:bCs w:val="false"/>
-          <w:color w:themeColor="text1" w:val="000000"/>
-          <w:sz w:val="32"/>
-          <w:szCs w:val="32"/>
-          <w:lang w:val="en-US"/>
-        </w:rPr>
-        <w:t xml:space="preserve">Keypad </w:t>
-      </w:r>
-      <w:r>
-        <w:rPr>
-          <w:rFonts w:ascii="TH Sarabun New" w:hAnsi="TH Sarabun New" w:eastAsia="TH SarabunPSK" w:cs="TH Sarabun New"/>
-          <w:b w:val="false"/>
-          <w:b w:val="false"/>
-          <w:bCs w:val="false"/>
-          <w:color w:themeColor="text1" w:val="000000"/>
-          <w:sz w:val="32"/>
-          <w:szCs w:val="32"/>
-          <w:lang w:val="en-US"/>
-        </w:rPr>
-        <w:t xml:space="preserve">เลือกชั้นวางและโต๊ะปลายทาง แล้วนำอาหารไปส่งตามลำดับที่กำหนด โดยให้ผู้ใช้งานยืนยันการรับอาหารก่อนเดินทางไปจุดถัดไปหรือกลับจุดบริการ หุ่นยนต์ต้องหยุดเมื่อ </w:t>
-      </w:r>
-      <w:r>
-        <w:rPr>
-          <w:rFonts w:eastAsia="TH SarabunPSK" w:cs="TH Sarabun New" w:ascii="TH Sarabun New" w:hAnsi="TH Sarabun New"/>
-          <w:b w:val="false"/>
-          <w:bCs w:val="false"/>
-          <w:color w:themeColor="text1" w:val="000000"/>
-          <w:sz w:val="32"/>
-          <w:szCs w:val="32"/>
-          <w:lang w:val="en-US"/>
-        </w:rPr>
-        <w:t xml:space="preserve">LiDAR </w:t>
-      </w:r>
-      <w:r>
-        <w:rPr>
-          <w:rFonts w:ascii="TH Sarabun New" w:hAnsi="TH Sarabun New" w:eastAsia="TH SarabunPSK" w:cs="TH Sarabun New"/>
-          <w:b w:val="false"/>
-          <w:b w:val="false"/>
-          <w:bCs w:val="false"/>
-          <w:color w:themeColor="text1" w:val="000000"/>
-          <w:sz w:val="32"/>
-          <w:szCs w:val="32"/>
-          <w:lang w:val="en-US"/>
-        </w:rPr>
-        <w:t xml:space="preserve">ตรวจพบสิ่งกีดขวาง แสดงทิศทางเลี้ยวผ่าน </w:t>
-      </w:r>
-      <w:r>
-        <w:rPr>
-          <w:rFonts w:eastAsia="TH SarabunPSK" w:cs="TH Sarabun New" w:ascii="TH Sarabun New" w:hAnsi="TH Sarabun New"/>
-          <w:b w:val="false"/>
-          <w:bCs w:val="false"/>
-          <w:color w:themeColor="text1" w:val="000000"/>
-          <w:sz w:val="32"/>
-          <w:szCs w:val="32"/>
-          <w:lang w:val="en-US"/>
-        </w:rPr>
-        <w:t xml:space="preserve">Dot Matrix </w:t>
-      </w:r>
-      <w:r>
-        <w:rPr>
-          <w:rFonts w:ascii="TH Sarabun New" w:hAnsi="TH Sarabun New" w:eastAsia="TH SarabunPSK" w:cs="TH Sarabun New"/>
-          <w:b w:val="false"/>
-          <w:b w:val="false"/>
-          <w:bCs w:val="false"/>
-          <w:color w:themeColor="text1" w:val="000000"/>
-          <w:sz w:val="32"/>
-          <w:szCs w:val="32"/>
-          <w:lang w:val="en-US"/>
-        </w:rPr>
-        <w:t xml:space="preserve">และรองรับการยกเลิกภารกิจอย่างปลอดภัย นอกจากนี้ยังศึกษาการทำงานร่วมกันของ </w:t>
-      </w:r>
-      <w:r>
-        <w:rPr>
-          <w:rFonts w:eastAsia="TH SarabunPSK" w:cs="TH Sarabun New" w:ascii="TH Sarabun New" w:hAnsi="TH Sarabun New"/>
-          <w:b w:val="false"/>
-          <w:bCs w:val="false"/>
-          <w:color w:themeColor="text1" w:val="000000"/>
-          <w:sz w:val="32"/>
-          <w:szCs w:val="32"/>
-          <w:lang w:val="en-US"/>
-        </w:rPr>
-        <w:t xml:space="preserve">Raspberry Pi, Arduino Uno, Encoder, LiDAR, ROS 2 </w:t>
-      </w:r>
-      <w:r>
-        <w:rPr>
-          <w:rFonts w:ascii="TH Sarabun New" w:hAnsi="TH Sarabun New" w:eastAsia="TH SarabunPSK" w:cs="TH Sarabun New"/>
-          <w:b w:val="false"/>
-          <w:b w:val="false"/>
-          <w:bCs w:val="false"/>
-          <w:color w:themeColor="text1" w:val="000000"/>
-          <w:sz w:val="32"/>
-          <w:szCs w:val="32"/>
-          <w:lang w:val="en-US"/>
-        </w:rPr>
-        <w:t xml:space="preserve">และ </w:t>
-      </w:r>
-      <w:r>
-        <w:rPr>
-          <w:rFonts w:eastAsia="TH SarabunPSK" w:cs="TH Sarabun New" w:ascii="TH Sarabun New" w:hAnsi="TH Sarabun New"/>
-          <w:b w:val="false"/>
-          <w:bCs w:val="false"/>
-          <w:color w:themeColor="text1" w:val="000000"/>
-          <w:sz w:val="32"/>
-          <w:szCs w:val="32"/>
-          <w:lang w:val="en-US"/>
-        </w:rPr>
-        <w:t xml:space="preserve">SLAM </w:t>
-      </w:r>
-      <w:r>
-        <w:rPr>
-          <w:rFonts w:ascii="TH Sarabun New" w:hAnsi="TH Sarabun New" w:eastAsia="TH SarabunPSK" w:cs="TH Sarabun New"/>
-          <w:b w:val="false"/>
-          <w:b w:val="false"/>
-          <w:bCs w:val="false"/>
-          <w:color w:themeColor="text1" w:val="000000"/>
-          <w:sz w:val="32"/>
-          <w:szCs w:val="32"/>
-          <w:lang w:val="en-US"/>
-        </w:rPr>
-        <w:t>เพื่อนำมาประยุกต์ใช้ในการควบคุมและนำทางหุ่นยนต์ภายในอาคาร</w:t>
-      </w:r>
-    </w:p>
-    <w:p>
-      <w:pPr>
-        <w:pStyle w:val="Normal"/>
-        <w:bidi w:val="0"/>
-        <w:spacing w:lineRule="auto" w:line="240" w:beforeAutospacing="0" w:before="0" w:afterAutospacing="0" w:after="200"/>
-        <w:ind w:firstLine="720"/>
-        <w:jc w:val="both"/>
-        <w:rPr>
           <w:rFonts w:ascii="TH Sarabun New" w:hAnsi="TH Sarabun New" w:eastAsia="TH SarabunPSK" w:cs="TH Sarabun New"/>
           <w:b/>
           <w:bCs/>
@@ -2476,9 +2152,6 @@
     <w:p>
       <w:pPr>
         <w:pStyle w:val="Normal"/>
-        <w:bidi w:val="0"/>
-        <w:spacing w:lineRule="auto" w:line="240" w:beforeAutospacing="0" w:before="0" w:afterAutospacing="0" w:after="200"/>
-        <w:ind w:firstLine="720"/>
         <w:jc w:val="both"/>
         <w:rPr>
           <w:rFonts w:ascii="TH Sarabun New" w:hAnsi="TH Sarabun New" w:cs="TH Sarabun New"/>
@@ -2488,246 +2161,90 @@
       </w:pPr>
       <w:r>
         <w:rPr>
-          <w:rFonts w:ascii="TH Sarabun New" w:hAnsi="TH Sarabun New" w:eastAsia="TH SarabunPSK" w:cs="TH Sarabun New"/>
-          <w:sz w:val="32"/>
-          <w:szCs w:val="32"/>
-          <w:lang w:bidi="ar-SA"/>
+          <w:rFonts w:ascii="TH Sarabun New" w:hAnsi="TH Sarabun New" w:eastAsia="TH Sarabun New" w:cs="TH Sarabun New"/>
+          <w:b w:val="false"/>
+          <w:b w:val="false"/>
+          <w:sz w:val="32"/>
+          <w:szCs w:val="32"/>
         </w:rPr>
         <w:t xml:space="preserve">โครงงานนี้ครอบคลุมการออกแบบและพัฒนาหุ่นยนต์ส่งอาหารต้นแบบแบบ </w:t>
       </w:r>
       <w:r>
         <w:rPr>
-          <w:rFonts w:eastAsia="TH SarabunPSK" w:cs="TH Sarabun New" w:ascii="TH Sarabun New" w:hAnsi="TH Sarabun New"/>
-          <w:sz w:val="32"/>
-          <w:szCs w:val="32"/>
-          <w:lang w:bidi="ar-SA"/>
+          <w:rFonts w:eastAsia="TH Sarabun New" w:cs="TH Sarabun New" w:ascii="TH Sarabun New" w:hAnsi="TH Sarabun New"/>
+          <w:b w:val="false"/>
+          <w:sz w:val="32"/>
+          <w:szCs w:val="32"/>
         </w:rPr>
         <w:t xml:space="preserve">Differential Drive </w:t>
       </w:r>
       <w:r>
         <w:rPr>
-          <w:rFonts w:ascii="TH Sarabun New" w:hAnsi="TH Sarabun New" w:eastAsia="TH SarabunPSK" w:cs="TH Sarabun New"/>
-          <w:sz w:val="32"/>
-          <w:szCs w:val="32"/>
-          <w:lang w:bidi="ar-SA"/>
-        </w:rPr>
-        <w:t xml:space="preserve">สำหรับทดสอบในพื้นที่จำลองภายในอาคาร โดยมีชั้นวางอาหาร </w:t>
-      </w:r>
-      <w:r>
-        <w:rPr>
-          <w:rFonts w:eastAsia="TH SarabunPSK" w:cs="TH Sarabun New" w:ascii="TH Sarabun New" w:hAnsi="TH Sarabun New"/>
-          <w:sz w:val="32"/>
-          <w:szCs w:val="32"/>
-          <w:lang w:bidi="ar-SA"/>
-        </w:rPr>
-        <w:t xml:space="preserve">2 </w:t>
-      </w:r>
-      <w:r>
-        <w:rPr>
-          <w:rFonts w:ascii="TH Sarabun New" w:hAnsi="TH Sarabun New" w:eastAsia="TH SarabunPSK" w:cs="TH Sarabun New"/>
-          <w:sz w:val="32"/>
-          <w:szCs w:val="32"/>
-          <w:lang w:bidi="ar-SA"/>
-        </w:rPr>
-        <w:t xml:space="preserve">ชั้น และกำหนดจุดบริการ ทางแยก กับโต๊ะปลายทางหมายเลข </w:t>
-      </w:r>
-      <w:r>
-        <w:rPr>
-          <w:rFonts w:eastAsia="TH SarabunPSK" w:cs="TH Sarabun New" w:ascii="TH Sarabun New" w:hAnsi="TH Sarabun New"/>
-          <w:sz w:val="32"/>
-          <w:szCs w:val="32"/>
-          <w:lang w:bidi="ar-SA"/>
-        </w:rPr>
-        <w:t xml:space="preserve">1 </w:t>
-      </w:r>
-      <w:r>
-        <w:rPr>
-          <w:rFonts w:ascii="TH Sarabun New" w:hAnsi="TH Sarabun New" w:eastAsia="TH SarabunPSK" w:cs="TH Sarabun New"/>
-          <w:sz w:val="32"/>
-          <w:szCs w:val="32"/>
-          <w:lang w:bidi="ar-SA"/>
-        </w:rPr>
-        <w:t xml:space="preserve">และ </w:t>
-      </w:r>
-      <w:r>
-        <w:rPr>
-          <w:rFonts w:eastAsia="TH SarabunPSK" w:cs="TH Sarabun New" w:ascii="TH Sarabun New" w:hAnsi="TH Sarabun New"/>
-          <w:sz w:val="32"/>
-          <w:szCs w:val="32"/>
-          <w:lang w:bidi="ar-SA"/>
-        </w:rPr>
-        <w:t xml:space="preserve">2 </w:t>
-      </w:r>
-      <w:r>
-        <w:rPr>
-          <w:rFonts w:ascii="TH Sarabun New" w:hAnsi="TH Sarabun New" w:eastAsia="TH SarabunPSK" w:cs="TH Sarabun New"/>
-          <w:sz w:val="32"/>
-          <w:szCs w:val="32"/>
-          <w:lang w:bidi="ar-SA"/>
-        </w:rPr>
-        <w:t xml:space="preserve">เป็น </w:t>
-      </w:r>
-      <w:r>
-        <w:rPr>
-          <w:rFonts w:eastAsia="TH SarabunPSK" w:cs="TH Sarabun New" w:ascii="TH Sarabun New" w:hAnsi="TH Sarabun New"/>
-          <w:sz w:val="32"/>
-          <w:szCs w:val="32"/>
-          <w:lang w:bidi="ar-SA"/>
-        </w:rPr>
-        <w:t xml:space="preserve">Waypoint </w:t>
-      </w:r>
-      <w:r>
-        <w:rPr>
-          <w:rFonts w:ascii="TH Sarabun New" w:hAnsi="TH Sarabun New" w:eastAsia="TH SarabunPSK" w:cs="TH Sarabun New"/>
-          <w:sz w:val="32"/>
-          <w:szCs w:val="32"/>
-          <w:lang w:bidi="ar-SA"/>
-        </w:rPr>
-        <w:t xml:space="preserve">ผู้ใช้เลือกชั้นวางและโต๊ะผ่านระบบ </w:t>
-      </w:r>
-      <w:r>
-        <w:rPr>
-          <w:rFonts w:eastAsia="TH SarabunPSK" w:cs="TH Sarabun New" w:ascii="TH Sarabun New" w:hAnsi="TH Sarabun New"/>
-          <w:sz w:val="32"/>
-          <w:szCs w:val="32"/>
-          <w:lang w:bidi="ar-SA"/>
+          <w:rFonts w:ascii="TH Sarabun New" w:hAnsi="TH Sarabun New" w:eastAsia="TH Sarabun New" w:cs="TH Sarabun New"/>
+          <w:b w:val="false"/>
+          <w:b w:val="false"/>
+          <w:sz w:val="32"/>
+          <w:szCs w:val="32"/>
+        </w:rPr>
+        <w:t xml:space="preserve">สำหรับร้านอาหารขนาดเล็ก โดยทดสอบในพื้นที่จำลองภายในอาคารและใช้เส้นทางกับ </w:t>
+      </w:r>
+      <w:r>
+        <w:rPr>
+          <w:rFonts w:ascii="TH Sarabun New" w:hAnsi="TH Sarabun New" w:eastAsia="TH Sarabun New" w:cs="TH Sarabun New"/>
+          <w:b w:val="false"/>
+          <w:b w:val="false"/>
+          <w:sz w:val="32"/>
+          <w:szCs w:val="32"/>
+        </w:rPr>
+        <w:t>ตำแหน่ง</w:t>
+      </w:r>
+      <w:r>
+        <w:rPr>
+          <w:rFonts w:ascii="TH Sarabun New" w:hAnsi="TH Sarabun New" w:eastAsia="TH Sarabun New" w:cs="TH Sarabun New"/>
+          <w:b w:val="false"/>
+          <w:b w:val="false"/>
+          <w:sz w:val="32"/>
+          <w:szCs w:val="32"/>
+        </w:rPr>
+        <w:t xml:space="preserve">ที่กำหนดไว้ล่วงหน้า ระบบรองรับการเลือกชั้นวางและโต๊ะปลายทางผ่านระบบ </w:t>
+      </w:r>
+      <w:r>
+        <w:rPr>
+          <w:rFonts w:eastAsia="TH Sarabun New" w:cs="TH Sarabun New" w:ascii="TH Sarabun New" w:hAnsi="TH Sarabun New"/>
+          <w:b w:val="false"/>
+          <w:sz w:val="32"/>
+          <w:szCs w:val="32"/>
         </w:rPr>
         <w:t xml:space="preserve">POS </w:t>
       </w:r>
       <w:r>
         <w:rPr>
-          <w:rFonts w:ascii="TH Sarabun New" w:hAnsi="TH Sarabun New" w:eastAsia="TH SarabunPSK" w:cs="TH Sarabun New"/>
-          <w:sz w:val="32"/>
-          <w:szCs w:val="32"/>
-          <w:lang w:bidi="ar-SA"/>
-        </w:rPr>
-        <w:t xml:space="preserve">บนหน้าจอสัมผัสหรือ </w:t>
-      </w:r>
-      <w:r>
-        <w:rPr>
-          <w:rFonts w:eastAsia="TH SarabunPSK" w:cs="TH Sarabun New" w:ascii="TH Sarabun New" w:hAnsi="TH Sarabun New"/>
-          <w:sz w:val="32"/>
-          <w:szCs w:val="32"/>
-          <w:lang w:bidi="ar-SA"/>
-        </w:rPr>
-        <w:t xml:space="preserve">Keypad 4×4 </w:t>
-      </w:r>
-      <w:r>
-        <w:rPr>
-          <w:rFonts w:ascii="TH Sarabun New" w:hAnsi="TH Sarabun New" w:eastAsia="TH SarabunPSK" w:cs="TH Sarabun New"/>
-          <w:sz w:val="32"/>
-          <w:szCs w:val="32"/>
-          <w:lang w:bidi="ar-SA"/>
-        </w:rPr>
-        <w:t xml:space="preserve">และยืนยันการรับอาหารเมื่อหุ่นยนต์ถึงโต๊ะ </w:t>
-      </w:r>
-      <w:r>
-        <w:rPr>
-          <w:rFonts w:eastAsia="TH SarabunPSK" w:cs="TH Sarabun New" w:ascii="TH Sarabun New" w:hAnsi="TH Sarabun New"/>
-          <w:sz w:val="32"/>
-          <w:szCs w:val="32"/>
-          <w:lang w:bidi="ar-SA"/>
-        </w:rPr>
-        <w:t xml:space="preserve">Raspberry Pi </w:t>
-      </w:r>
-      <w:r>
-        <w:rPr>
-          <w:rFonts w:ascii="TH Sarabun New" w:hAnsi="TH Sarabun New" w:eastAsia="TH SarabunPSK" w:cs="TH Sarabun New"/>
-          <w:sz w:val="32"/>
-          <w:szCs w:val="32"/>
-          <w:lang w:bidi="ar-SA"/>
-        </w:rPr>
-        <w:t xml:space="preserve">ควบคุมลำดับภารกิจและประมวลผลข้อมูลจาก </w:t>
-      </w:r>
-      <w:r>
-        <w:rPr>
-          <w:rFonts w:eastAsia="TH SarabunPSK" w:cs="TH Sarabun New" w:ascii="TH Sarabun New" w:hAnsi="TH Sarabun New"/>
-          <w:sz w:val="32"/>
-          <w:szCs w:val="32"/>
-          <w:lang w:bidi="ar-SA"/>
-        </w:rPr>
-        <w:t xml:space="preserve">ROS 2, LiDAR </w:t>
-      </w:r>
-      <w:r>
-        <w:rPr>
-          <w:rFonts w:ascii="TH Sarabun New" w:hAnsi="TH Sarabun New" w:eastAsia="TH SarabunPSK" w:cs="TH Sarabun New"/>
-          <w:sz w:val="32"/>
-          <w:szCs w:val="32"/>
-          <w:lang w:bidi="ar-SA"/>
-        </w:rPr>
-        <w:t xml:space="preserve">และ </w:t>
-      </w:r>
-      <w:r>
-        <w:rPr>
-          <w:rFonts w:eastAsia="TH SarabunPSK" w:cs="TH Sarabun New" w:ascii="TH Sarabun New" w:hAnsi="TH Sarabun New"/>
-          <w:sz w:val="32"/>
-          <w:szCs w:val="32"/>
-          <w:lang w:bidi="ar-SA"/>
-        </w:rPr>
-        <w:t xml:space="preserve">SLAM </w:t>
-      </w:r>
-      <w:r>
-        <w:rPr>
-          <w:rFonts w:ascii="TH Sarabun New" w:hAnsi="TH Sarabun New" w:eastAsia="TH SarabunPSK" w:cs="TH Sarabun New"/>
-          <w:sz w:val="32"/>
-          <w:szCs w:val="32"/>
-          <w:lang w:bidi="ar-SA"/>
-        </w:rPr>
-        <w:t xml:space="preserve">ส่วน </w:t>
-      </w:r>
-      <w:r>
-        <w:rPr>
-          <w:rFonts w:eastAsia="TH SarabunPSK" w:cs="TH Sarabun New" w:ascii="TH Sarabun New" w:hAnsi="TH Sarabun New"/>
-          <w:sz w:val="32"/>
-          <w:szCs w:val="32"/>
-          <w:lang w:bidi="ar-SA"/>
-        </w:rPr>
-        <w:t xml:space="preserve">Arduino Uno </w:t>
-      </w:r>
-      <w:r>
-        <w:rPr>
-          <w:rFonts w:ascii="TH Sarabun New" w:hAnsi="TH Sarabun New" w:eastAsia="TH SarabunPSK" w:cs="TH Sarabun New"/>
-          <w:sz w:val="32"/>
-          <w:szCs w:val="32"/>
-          <w:lang w:bidi="ar-SA"/>
-        </w:rPr>
-        <w:t xml:space="preserve">ควบคุมมอเตอร์ อ่าน </w:t>
-      </w:r>
-      <w:r>
-        <w:rPr>
-          <w:rFonts w:eastAsia="TH SarabunPSK" w:cs="TH Sarabun New" w:ascii="TH Sarabun New" w:hAnsi="TH Sarabun New"/>
-          <w:sz w:val="32"/>
-          <w:szCs w:val="32"/>
-          <w:lang w:bidi="ar-SA"/>
-        </w:rPr>
-        <w:t xml:space="preserve">Encoder </w:t>
-      </w:r>
-      <w:r>
-        <w:rPr>
-          <w:rFonts w:ascii="TH Sarabun New" w:hAnsi="TH Sarabun New" w:eastAsia="TH SarabunPSK" w:cs="TH Sarabun New"/>
-          <w:sz w:val="32"/>
-          <w:szCs w:val="32"/>
-          <w:lang w:bidi="ar-SA"/>
-        </w:rPr>
-        <w:t xml:space="preserve">และแสดงสัญญาณเลี้ยวผ่าน </w:t>
-      </w:r>
-      <w:r>
-        <w:rPr>
-          <w:rFonts w:eastAsia="TH SarabunPSK" w:cs="TH Sarabun New" w:ascii="TH Sarabun New" w:hAnsi="TH Sarabun New"/>
-          <w:sz w:val="32"/>
-          <w:szCs w:val="32"/>
-          <w:lang w:bidi="ar-SA"/>
-        </w:rPr>
-        <w:t xml:space="preserve">Dot Matrix </w:t>
-      </w:r>
-      <w:r>
-        <w:rPr>
-          <w:rFonts w:ascii="TH Sarabun New" w:hAnsi="TH Sarabun New" w:eastAsia="TH SarabunPSK" w:cs="TH Sarabun New"/>
-          <w:sz w:val="32"/>
-          <w:szCs w:val="32"/>
-          <w:lang w:bidi="ar-SA"/>
-        </w:rPr>
-        <w:t>ระบบหยุดรอเมื่อพบสิ่งกีดขวางด้านหน้า และสั่งหยุดเมื่อผู้ใช้ยกเลิกภารกิจได้ การประเมินจำกัดอยู่ที่การทดสอบซอฟต์แวร์ การสื่อสารระหว่างอุปกรณ์ และการทดลองเคลื่อนที่ในพื้นที่จำลอง โดยยังไม่ครอบคลุมการใช้งานจริงในร้านอาหารหรือการวางเส้นทางอ้อมสิ่งกีดขวาง</w:t>
+          <w:rFonts w:ascii="TH Sarabun New" w:hAnsi="TH Sarabun New" w:eastAsia="TH Sarabun New" w:cs="TH Sarabun New"/>
+          <w:b w:val="false"/>
+          <w:b w:val="false"/>
+          <w:sz w:val="32"/>
+          <w:szCs w:val="32"/>
+        </w:rPr>
+        <w:t xml:space="preserve">หรือ </w:t>
+      </w:r>
+      <w:r>
+        <w:rPr>
+          <w:rFonts w:eastAsia="TH Sarabun New" w:cs="TH Sarabun New" w:ascii="TH Sarabun New" w:hAnsi="TH Sarabun New"/>
+          <w:b w:val="false"/>
+          <w:sz w:val="32"/>
+          <w:szCs w:val="32"/>
+        </w:rPr>
+        <w:t xml:space="preserve">Keypad </w:t>
+      </w:r>
+      <w:r>
+        <w:rPr>
+          <w:rFonts w:ascii="TH Sarabun New" w:hAnsi="TH Sarabun New" w:eastAsia="TH Sarabun New" w:cs="TH Sarabun New"/>
+          <w:b w:val="false"/>
+          <w:b w:val="false"/>
+          <w:sz w:val="32"/>
+          <w:szCs w:val="32"/>
+        </w:rPr>
+        <w:t>รวมถึงการควบคุมการเคลื่อนที่ การสื่อสารระหว่างระบบ การตรวจจับสิ่งกีดขวาง และการยืนยันภารกิจ การประเมินจำกัดอยู่ที่การทดสอบซอฟต์แวร์ การสื่อสารระหว่างอุปกรณ์ และการเคลื่อนที่ในพื้นที่จำลอง</w:t>
       </w:r>
     </w:p>
     <w:tbl>
@@ -3715,9 +3232,11 @@
       <w:pPr>
         <w:pStyle w:val="Normal"/>
         <w:bidi w:val="0"/>
-        <w:spacing w:lineRule="auto" w:line="240"/>
-        <w:rPr>
-          <w:rFonts w:ascii="TH Sarabun New" w:hAnsi="TH Sarabun New" w:cs="TH Sarabun New"/>
+        <w:spacing w:lineRule="auto" w:line="240" w:beforeAutospacing="0" w:before="0" w:afterAutospacing="0" w:after="200"/>
+        <w:ind w:hanging="0"/>
+        <w:jc w:val="start"/>
+        <w:rPr>
+          <w:rFonts w:ascii="TH Sarabun New" w:hAnsi="TH Sarabun New" w:eastAsia="TH Sarabun New" w:cs="TH Sarabun New"/>
           <w:b/>
           <w:bCs/>
           <w:sz w:val="32"/>
@@ -3726,7 +3245,7 @@
       </w:pPr>
       <w:r>
         <w:rPr>
-          <w:rFonts w:cs="TH Sarabun New" w:ascii="TH Sarabun New" w:hAnsi="TH Sarabun New"/>
+          <w:rFonts w:eastAsia="TH Sarabun New" w:cs="TH Sarabun New" w:ascii="TH Sarabun New" w:hAnsi="TH Sarabun New"/>
           <w:b/>
           <w:bCs/>
           <w:sz w:val="32"/>
@@ -3739,6 +3258,41 @@
         <w:pStyle w:val="Normal"/>
         <w:bidi w:val="0"/>
         <w:spacing w:lineRule="auto" w:line="240" w:beforeAutospacing="0" w:before="0" w:afterAutospacing="0" w:after="200"/>
+        <w:ind w:hanging="0"/>
+        <w:jc w:val="start"/>
+        <w:rPr>
+          <w:rFonts w:ascii="TH Sarabun New" w:hAnsi="TH Sarabun New" w:eastAsia="TH Sarabun New" w:cs="TH Sarabun New"/>
+          <w:b/>
+          <w:bCs/>
+          <w:sz w:val="32"/>
+          <w:szCs w:val="32"/>
+        </w:rPr>
+      </w:pPr>
+      <w:r>
+        <w:rPr>
+          <w:rFonts w:eastAsia="TH Sarabun New" w:cs="TH Sarabun New" w:ascii="TH Sarabun New" w:hAnsi="TH Sarabun New"/>
+          <w:b/>
+          <w:bCs/>
+          <w:sz w:val="32"/>
+          <w:szCs w:val="32"/>
+        </w:rPr>
+        <w:t xml:space="preserve">1.4 </w:t>
+      </w:r>
+      <w:r>
+        <w:rPr>
+          <w:rFonts w:ascii="TH Sarabun New" w:hAnsi="TH Sarabun New" w:eastAsia="TH Sarabun New" w:cs="TH Sarabun New"/>
+          <w:b/>
+          <w:b/>
+          <w:bCs/>
+          <w:sz w:val="32"/>
+          <w:szCs w:val="32"/>
+        </w:rPr>
+        <w:t>ประโยชน์ที่คาดว่าจะได้รับ</w:t>
+      </w:r>
+    </w:p>
+    <w:p>
+      <w:pPr>
+        <w:pStyle w:val="Normal"/>
         <w:jc w:val="both"/>
         <w:rPr>
           <w:rFonts w:ascii="TH Sarabun New" w:hAnsi="TH Sarabun New" w:cs="TH Sarabun New"/>
@@ -3748,14 +3302,242 @@
       </w:pPr>
       <w:r>
         <w:rPr>
-          <w:rFonts w:eastAsia="TH SarabunPSK" w:cs="TH Sarabun New" w:ascii="TH Sarabun New" w:hAnsi="TH Sarabun New"/>
-          <w:b/>
-          <w:bCs/>
-          <w:sz w:val="32"/>
-          <w:szCs w:val="32"/>
-          <w:lang w:val="en-US"/>
+          <w:rFonts w:eastAsia="TH Sarabun New" w:cs="TH Sarabun New" w:ascii="TH Sarabun New" w:hAnsi="TH Sarabun New"/>
+          <w:b w:val="false"/>
+          <w:sz w:val="32"/>
+          <w:szCs w:val="32"/>
+        </w:rPr>
+        <w:t>1</w:t>
+      </w:r>
+      <w:r>
+        <w:rPr>
+          <w:rFonts w:eastAsia="TH Sarabun New" w:cs="TH Sarabun New" w:ascii="TH Sarabun New" w:hAnsi="TH Sarabun New"/>
+          <w:b w:val="false"/>
+          <w:sz w:val="32"/>
+          <w:szCs w:val="32"/>
+        </w:rPr>
+        <w:t>.4.1.</w:t>
+      </w:r>
+      <w:r>
+        <w:rPr>
+          <w:rFonts w:eastAsia="TH Sarabun New" w:cs="TH Sarabun New" w:ascii="TH Sarabun New" w:hAnsi="TH Sarabun New"/>
+          <w:b w:val="false"/>
+          <w:sz w:val="32"/>
+          <w:szCs w:val="32"/>
         </w:rPr>
         <w:t xml:space="preserve"> </w:t>
+      </w:r>
+      <w:r>
+        <w:rPr>
+          <w:rFonts w:ascii="TH Sarabun New" w:hAnsi="TH Sarabun New" w:eastAsia="TH Sarabun New" w:cs="TH Sarabun New"/>
+          <w:b w:val="false"/>
+          <w:b w:val="false"/>
+          <w:sz w:val="32"/>
+          <w:szCs w:val="32"/>
+        </w:rPr>
+        <w:t xml:space="preserve">ได้ต้นแบบหุ่นยนต์ส่งอาหารอัตโนมัติสำหรับทดสอบการทำงานในพื้นที่จำลอง </w:t>
+      </w:r>
+      <w:r>
+        <w:rPr>
+          <w:rFonts w:ascii="TH Sarabun New" w:hAnsi="TH Sarabun New" w:eastAsia="TH Sarabun New" w:cs="TH Sarabun New"/>
+          <w:b w:val="false"/>
+          <w:b w:val="false"/>
+          <w:sz w:val="32"/>
+          <w:szCs w:val="32"/>
+        </w:rPr>
+        <w:t>เพื่อแก้ปัญหาการบริหารของพนักงานเสิร์ฟอาหาร</w:t>
+      </w:r>
+    </w:p>
+    <w:p>
+      <w:pPr>
+        <w:pStyle w:val="Normal"/>
+        <w:jc w:val="both"/>
+        <w:rPr>
+          <w:rFonts w:ascii="TH Sarabun New" w:hAnsi="TH Sarabun New" w:cs="TH Sarabun New"/>
+          <w:sz w:val="32"/>
+          <w:szCs w:val="32"/>
+        </w:rPr>
+      </w:pPr>
+      <w:r>
+        <w:rPr>
+          <w:rFonts w:eastAsia="TH Sarabun New" w:cs="TH Sarabun New" w:ascii="TH Sarabun New" w:hAnsi="TH Sarabun New"/>
+          <w:b w:val="false"/>
+          <w:sz w:val="32"/>
+          <w:szCs w:val="32"/>
+        </w:rPr>
+        <w:t>1</w:t>
+      </w:r>
+      <w:r>
+        <w:rPr>
+          <w:rFonts w:eastAsia="TH Sarabun New" w:cs="TH Sarabun New" w:ascii="TH Sarabun New" w:hAnsi="TH Sarabun New"/>
+          <w:b w:val="false"/>
+          <w:sz w:val="32"/>
+          <w:szCs w:val="32"/>
+        </w:rPr>
+        <w:t>.4.2.</w:t>
+      </w:r>
+      <w:r>
+        <w:rPr>
+          <w:rFonts w:eastAsia="TH Sarabun New" w:cs="TH Sarabun New" w:ascii="TH Sarabun New" w:hAnsi="TH Sarabun New"/>
+          <w:b w:val="false"/>
+          <w:sz w:val="32"/>
+          <w:szCs w:val="32"/>
+        </w:rPr>
+        <w:t xml:space="preserve"> </w:t>
+      </w:r>
+      <w:r>
+        <w:rPr>
+          <w:rFonts w:ascii="TH Sarabun New" w:hAnsi="TH Sarabun New" w:eastAsia="TH Sarabun New" w:cs="TH Sarabun New"/>
+          <w:b w:val="false"/>
+          <w:b w:val="false"/>
+          <w:sz w:val="32"/>
+          <w:szCs w:val="32"/>
+        </w:rPr>
+        <w:t>ได้ศึกษาแนวทางการประยุกต์ใช้ระบบสมองกลฝังตัวและระบบอัตโนมัติกับงานบริการ</w:t>
+      </w:r>
+    </w:p>
+    <w:p>
+      <w:pPr>
+        <w:pStyle w:val="Normal"/>
+        <w:jc w:val="both"/>
+        <w:rPr>
+          <w:rFonts w:ascii="TH Sarabun New" w:hAnsi="TH Sarabun New" w:cs="TH Sarabun New"/>
+          <w:sz w:val="32"/>
+          <w:szCs w:val="32"/>
+        </w:rPr>
+      </w:pPr>
+      <w:r>
+        <w:rPr>
+          <w:rFonts w:eastAsia="TH Sarabun New" w:cs="TH Sarabun New" w:ascii="TH Sarabun New" w:hAnsi="TH Sarabun New"/>
+          <w:b w:val="false"/>
+          <w:sz w:val="32"/>
+          <w:szCs w:val="32"/>
+        </w:rPr>
+        <w:t>1</w:t>
+      </w:r>
+      <w:r>
+        <w:rPr>
+          <w:rFonts w:eastAsia="TH Sarabun New" w:cs="TH Sarabun New" w:ascii="TH Sarabun New" w:hAnsi="TH Sarabun New"/>
+          <w:b w:val="false"/>
+          <w:sz w:val="32"/>
+          <w:szCs w:val="32"/>
+        </w:rPr>
+        <w:t>.4.3.</w:t>
+      </w:r>
+      <w:r>
+        <w:rPr>
+          <w:rFonts w:eastAsia="TH Sarabun New" w:cs="TH Sarabun New" w:ascii="TH Sarabun New" w:hAnsi="TH Sarabun New"/>
+          <w:b w:val="false"/>
+          <w:sz w:val="32"/>
+          <w:szCs w:val="32"/>
+        </w:rPr>
+        <w:t xml:space="preserve"> </w:t>
+      </w:r>
+      <w:r>
+        <w:rPr>
+          <w:rFonts w:ascii="TH Sarabun New" w:hAnsi="TH Sarabun New" w:eastAsia="TH Sarabun New" w:cs="TH Sarabun New"/>
+          <w:b w:val="false"/>
+          <w:b w:val="false"/>
+          <w:sz w:val="32"/>
+          <w:szCs w:val="32"/>
+        </w:rPr>
+        <w:t>ได้ฝึกการบูรณาการการควบคุม การสื่อสาร การตรวจจับสภาพแวดล้อม และการนำทางอัตโนมัติ</w:t>
+      </w:r>
+    </w:p>
+    <w:p>
+      <w:pPr>
+        <w:pStyle w:val="Normal"/>
+        <w:jc w:val="both"/>
+        <w:rPr>
+          <w:rFonts w:ascii="TH Sarabun New" w:hAnsi="TH Sarabun New" w:cs="TH Sarabun New"/>
+          <w:sz w:val="32"/>
+          <w:szCs w:val="32"/>
+        </w:rPr>
+      </w:pPr>
+      <w:r>
+        <w:rPr>
+          <w:rFonts w:eastAsia="TH Sarabun New" w:cs="TH Sarabun New" w:ascii="TH Sarabun New" w:hAnsi="TH Sarabun New"/>
+          <w:b w:val="false"/>
+          <w:sz w:val="32"/>
+          <w:szCs w:val="32"/>
+        </w:rPr>
+        <w:t>1</w:t>
+      </w:r>
+      <w:r>
+        <w:rPr>
+          <w:rFonts w:eastAsia="TH Sarabun New" w:cs="TH Sarabun New" w:ascii="TH Sarabun New" w:hAnsi="TH Sarabun New"/>
+          <w:b w:val="false"/>
+          <w:sz w:val="32"/>
+          <w:szCs w:val="32"/>
+        </w:rPr>
+        <w:t>.4.4.</w:t>
+      </w:r>
+      <w:r>
+        <w:rPr>
+          <w:rFonts w:eastAsia="TH Sarabun New" w:cs="TH Sarabun New" w:ascii="TH Sarabun New" w:hAnsi="TH Sarabun New"/>
+          <w:b w:val="false"/>
+          <w:sz w:val="32"/>
+          <w:szCs w:val="32"/>
+        </w:rPr>
+        <w:t xml:space="preserve"> </w:t>
+      </w:r>
+      <w:r>
+        <w:rPr>
+          <w:rFonts w:ascii="TH Sarabun New" w:hAnsi="TH Sarabun New" w:eastAsia="TH Sarabun New" w:cs="TH Sarabun New"/>
+          <w:b w:val="false"/>
+          <w:b w:val="false"/>
+          <w:sz w:val="32"/>
+          <w:szCs w:val="32"/>
+        </w:rPr>
+        <w:t>ได้แนวทางสำหรับพัฒนาระบบช่วยขนส่งอาหารในร้านอาหารขนาดเล็ก</w:t>
+      </w:r>
+    </w:p>
+    <w:p>
+      <w:pPr>
+        <w:pStyle w:val="Normal"/>
+        <w:jc w:val="both"/>
+        <w:rPr>
+          <w:rFonts w:ascii="TH Sarabun New" w:hAnsi="TH Sarabun New" w:cs="TH Sarabun New"/>
+          <w:sz w:val="32"/>
+          <w:szCs w:val="32"/>
+        </w:rPr>
+      </w:pPr>
+      <w:r>
+        <w:rPr>
+          <w:rFonts w:eastAsia="TH Sarabun New" w:cs="TH Sarabun New" w:ascii="TH Sarabun New" w:hAnsi="TH Sarabun New"/>
+          <w:b w:val="false"/>
+          <w:sz w:val="32"/>
+          <w:szCs w:val="32"/>
+        </w:rPr>
+        <w:t>1</w:t>
+      </w:r>
+      <w:r>
+        <w:rPr>
+          <w:rFonts w:eastAsia="TH Sarabun New" w:cs="TH Sarabun New" w:ascii="TH Sarabun New" w:hAnsi="TH Sarabun New"/>
+          <w:b w:val="false"/>
+          <w:sz w:val="32"/>
+          <w:szCs w:val="32"/>
+        </w:rPr>
+        <w:t>.4.5.</w:t>
+      </w:r>
+      <w:r>
+        <w:rPr>
+          <w:rFonts w:eastAsia="TH Sarabun New" w:cs="TH Sarabun New" w:ascii="TH Sarabun New" w:hAnsi="TH Sarabun New"/>
+          <w:b w:val="false"/>
+          <w:sz w:val="32"/>
+          <w:szCs w:val="32"/>
+        </w:rPr>
+        <w:t xml:space="preserve"> </w:t>
+      </w:r>
+      <w:r>
+        <w:rPr>
+          <w:rFonts w:ascii="TH Sarabun New" w:hAnsi="TH Sarabun New" w:eastAsia="TH Sarabun New" w:cs="TH Sarabun New"/>
+          <w:b w:val="false"/>
+          <w:b w:val="false"/>
+          <w:sz w:val="32"/>
+          <w:szCs w:val="32"/>
+        </w:rPr>
+        <w:t>ได้พื้นฐานสำหรับการพัฒนาหุ่นยนต์บริการที่มีความสามารถสูงขึ้นในอนาคต</w:t>
       </w:r>
     </w:p>
     <w:p>
@@ -3763,54 +3545,92 @@
         <w:pStyle w:val="Normal"/>
         <w:bidi w:val="0"/>
         <w:spacing w:lineRule="auto" w:line="240" w:beforeAutospacing="0" w:before="0" w:afterAutospacing="0" w:after="200"/>
-        <w:jc w:val="both"/>
+        <w:ind w:hanging="0"/>
+        <w:jc w:val="start"/>
         <w:rPr>
           <w:rFonts w:ascii="TH Sarabun New" w:hAnsi="TH Sarabun New" w:cs="TH Sarabun New"/>
+          <w:b/>
+          <w:bCs/>
           <w:sz w:val="32"/>
           <w:szCs w:val="32"/>
         </w:rPr>
       </w:pPr>
       <w:r>
         <w:rPr>
-          <w:rFonts w:eastAsia="TH SarabunPSK" w:cs="TH Sarabun New" w:ascii="TH Sarabun New" w:hAnsi="TH Sarabun New"/>
-          <w:b/>
-          <w:bCs/>
-          <w:sz w:val="32"/>
-          <w:szCs w:val="32"/>
-          <w:lang w:val="en-US"/>
-        </w:rPr>
-        <w:t xml:space="preserve"> </w:t>
+          <w:rFonts w:eastAsia="TH Sarabun New" w:cs="TH Sarabun New" w:ascii="TH Sarabun New" w:hAnsi="TH Sarabun New"/>
+          <w:b/>
+          <w:bCs/>
+          <w:sz w:val="32"/>
+          <w:szCs w:val="32"/>
+        </w:rPr>
+        <w:t xml:space="preserve">1.5 </w:t>
+      </w:r>
+      <w:r>
+        <w:rPr>
+          <w:rFonts w:ascii="TH Sarabun New" w:hAnsi="TH Sarabun New" w:eastAsia="TH Sarabun New" w:cs="TH Sarabun New"/>
+          <w:b/>
+          <w:b/>
+          <w:bCs/>
+          <w:sz w:val="32"/>
+          <w:szCs w:val="32"/>
+        </w:rPr>
+        <w:t>นิยามศัพท์เฉพาะ</w:t>
       </w:r>
     </w:p>
     <w:p>
       <w:pPr>
         <w:pStyle w:val="Normal"/>
-        <w:bidi w:val="0"/>
-        <w:spacing w:lineRule="auto" w:line="240" w:beforeAutospacing="0" w:before="0" w:afterAutospacing="0" w:after="200"/>
         <w:jc w:val="both"/>
         <w:rPr>
-          <w:rFonts w:ascii="TH Sarabun New" w:hAnsi="TH Sarabun New" w:eastAsia="TH SarabunPSK" w:cs="TH Sarabun New"/>
-          <w:b/>
-          <w:bCs/>
+          <w:rFonts w:ascii="TH Sarabun New" w:hAnsi="TH Sarabun New" w:cs="TH Sarabun New"/>
           <w:sz w:val="32"/>
           <w:szCs w:val="32"/>
         </w:rPr>
       </w:pPr>
       <w:r>
         <w:rPr>
-          <w:rFonts w:eastAsia="TH SarabunPSK" w:cs="TH Sarabun New" w:ascii="TH Sarabun New" w:hAnsi="TH Sarabun New"/>
-          <w:b/>
-          <w:bCs/>
-          <w:sz w:val="32"/>
-          <w:szCs w:val="32"/>
-        </w:rPr>
+          <w:rFonts w:ascii="TH Sarabun New" w:hAnsi="TH Sarabun New" w:eastAsia="TH Sarabun New" w:cs="TH Sarabun New"/>
+          <w:b/>
+          <w:b/>
+          <w:bCs/>
+          <w:sz w:val="32"/>
+          <w:szCs w:val="32"/>
+        </w:rPr>
+        <w:t xml:space="preserve">ระบบสมองกลฝังตัว </w:t>
+      </w:r>
+      <w:r>
+        <w:rPr>
+          <w:rFonts w:eastAsia="TH Sarabun New" w:cs="TH Sarabun New" w:ascii="TH Sarabun New" w:hAnsi="TH Sarabun New"/>
+          <w:b/>
+          <w:bCs/>
+          <w:sz w:val="32"/>
+          <w:szCs w:val="32"/>
+        </w:rPr>
+        <w:t>(Embedded System)</w:t>
+      </w:r>
+      <w:r>
+        <w:rPr>
+          <w:rFonts w:eastAsia="TH Sarabun New" w:cs="TH Sarabun New" w:ascii="TH Sarabun New" w:hAnsi="TH Sarabun New"/>
+          <w:b w:val="false"/>
+          <w:sz w:val="32"/>
+          <w:szCs w:val="32"/>
+        </w:rPr>
+        <w:t xml:space="preserve"> </w:t>
+      </w:r>
+      <w:r>
+        <w:rPr>
+          <w:rFonts w:ascii="TH Sarabun New" w:hAnsi="TH Sarabun New" w:eastAsia="TH Sarabun New" w:cs="TH Sarabun New"/>
+          <w:b w:val="false"/>
+          <w:b w:val="false"/>
+          <w:sz w:val="32"/>
+          <w:szCs w:val="32"/>
+        </w:rPr>
+        <w:t>หมายถึง ระบบคอมพิวเตอร์ที่ออกแบบให้ทำงานเฉพาะด้าน โดยสามารถรับข้อมูล ประมวลผล และควบคุมอุปกรณ์ตามวัตถุประสงค์ที่กำหนด</w:t>
       </w:r>
     </w:p>
     <w:p>
       <w:pPr>
         <w:pStyle w:val="Normal"/>
-        <w:bidi w:val="0"/>
-        <w:spacing w:lineRule="auto" w:line="240" w:beforeAutospacing="0" w:before="0" w:afterAutospacing="0" w:after="200"/>
         <w:jc w:val="both"/>
         <w:rPr>
           <w:rFonts w:ascii="TH Sarabun New" w:hAnsi="TH Sarabun New" w:cs="TH Sarabun New"/>
@@ -3820,15 +3640,376 @@
       </w:pPr>
       <w:r>
         <w:rPr>
-          <w:rFonts w:eastAsia="TH SarabunPSK" w:cs="TH Sarabun New" w:ascii="TH Sarabun New" w:hAnsi="TH Sarabun New"/>
-          <w:b/>
-          <w:bCs/>
-          <w:color w:themeColor="text1" w:val="000000"/>
-          <w:sz w:val="32"/>
-          <w:szCs w:val="32"/>
-          <w:lang w:val="en-US"/>
+          <w:rFonts w:ascii="TH Sarabun New" w:hAnsi="TH Sarabun New" w:eastAsia="TH Sarabun New" w:cs="TH Sarabun New"/>
+          <w:b/>
+          <w:b/>
+          <w:bCs/>
+          <w:sz w:val="32"/>
+          <w:szCs w:val="32"/>
+        </w:rPr>
+        <w:t xml:space="preserve">ระบบอัตโนมัติ </w:t>
+      </w:r>
+      <w:r>
+        <w:rPr>
+          <w:rFonts w:eastAsia="TH Sarabun New" w:cs="TH Sarabun New" w:ascii="TH Sarabun New" w:hAnsi="TH Sarabun New"/>
+          <w:b/>
+          <w:bCs/>
+          <w:sz w:val="32"/>
+          <w:szCs w:val="32"/>
+        </w:rPr>
+        <w:t>(Automation)</w:t>
+      </w:r>
+      <w:r>
+        <w:rPr>
+          <w:rFonts w:eastAsia="TH Sarabun New" w:cs="TH Sarabun New" w:ascii="TH Sarabun New" w:hAnsi="TH Sarabun New"/>
+          <w:b w:val="false"/>
+          <w:sz w:val="32"/>
+          <w:szCs w:val="32"/>
         </w:rPr>
         <w:t xml:space="preserve"> </w:t>
+      </w:r>
+      <w:r>
+        <w:rPr>
+          <w:rFonts w:ascii="TH Sarabun New" w:hAnsi="TH Sarabun New" w:eastAsia="TH Sarabun New" w:cs="TH Sarabun New"/>
+          <w:b w:val="false"/>
+          <w:b w:val="false"/>
+          <w:sz w:val="32"/>
+          <w:szCs w:val="32"/>
+        </w:rPr>
+        <w:t>หมายถึง การใช้ระบบควบคุมและเทคโนโลยีเพื่อให้กระบวนการทำงานดำเนินไปตามเงื่อนไขที่กำหนด โดยลดการควบคุมจากมนุษย์ในขั้นตอนที่ทำซ้ำ</w:t>
+      </w:r>
+    </w:p>
+    <w:p>
+      <w:pPr>
+        <w:pStyle w:val="Normal"/>
+        <w:jc w:val="both"/>
+        <w:rPr>
+          <w:rFonts w:ascii="TH Sarabun New" w:hAnsi="TH Sarabun New" w:cs="TH Sarabun New"/>
+          <w:sz w:val="32"/>
+          <w:szCs w:val="32"/>
+        </w:rPr>
+      </w:pPr>
+      <w:r>
+        <w:rPr>
+          <w:rFonts w:ascii="TH Sarabun New" w:hAnsi="TH Sarabun New" w:eastAsia="TH Sarabun New" w:cs="TH Sarabun New"/>
+          <w:b/>
+          <w:b/>
+          <w:bCs/>
+          <w:sz w:val="32"/>
+          <w:szCs w:val="32"/>
+        </w:rPr>
+        <w:t xml:space="preserve">หุ่นยนต์ส่งอาหาร </w:t>
+      </w:r>
+      <w:r>
+        <w:rPr>
+          <w:rFonts w:eastAsia="TH Sarabun New" w:cs="TH Sarabun New" w:ascii="TH Sarabun New" w:hAnsi="TH Sarabun New"/>
+          <w:b/>
+          <w:bCs/>
+          <w:sz w:val="32"/>
+          <w:szCs w:val="32"/>
+        </w:rPr>
+        <w:t>(Food Delivery Robot)</w:t>
+      </w:r>
+      <w:r>
+        <w:rPr>
+          <w:rFonts w:eastAsia="TH Sarabun New" w:cs="TH Sarabun New" w:ascii="TH Sarabun New" w:hAnsi="TH Sarabun New"/>
+          <w:b w:val="false"/>
+          <w:sz w:val="32"/>
+          <w:szCs w:val="32"/>
+        </w:rPr>
+        <w:t xml:space="preserve"> </w:t>
+      </w:r>
+      <w:r>
+        <w:rPr>
+          <w:rFonts w:ascii="TH Sarabun New" w:hAnsi="TH Sarabun New" w:eastAsia="TH Sarabun New" w:cs="TH Sarabun New"/>
+          <w:b w:val="false"/>
+          <w:b w:val="false"/>
+          <w:sz w:val="32"/>
+          <w:szCs w:val="32"/>
+        </w:rPr>
+        <w:t>หมายถึง หุ่นยนต์บริการที่ใช้ช่วยลำเลียงอาหารจากจุดเตรียมอาหารไปยังจุดหมายภายในพื้นที่ที่กำหนด</w:t>
+      </w:r>
+    </w:p>
+    <w:p>
+      <w:pPr>
+        <w:pStyle w:val="Normal"/>
+        <w:jc w:val="both"/>
+        <w:rPr>
+          <w:rFonts w:ascii="TH Sarabun New" w:hAnsi="TH Sarabun New" w:cs="TH Sarabun New"/>
+          <w:sz w:val="32"/>
+          <w:szCs w:val="32"/>
+        </w:rPr>
+      </w:pPr>
+      <w:r>
+        <w:rPr>
+          <w:rFonts w:eastAsia="TH Sarabun New" w:cs="TH Sarabun New" w:ascii="TH Sarabun New" w:hAnsi="TH Sarabun New"/>
+          <w:b/>
+          <w:bCs/>
+          <w:sz w:val="32"/>
+          <w:szCs w:val="32"/>
+        </w:rPr>
+        <w:t>Differential Drive</w:t>
+      </w:r>
+      <w:r>
+        <w:rPr>
+          <w:rFonts w:eastAsia="TH Sarabun New" w:cs="TH Sarabun New" w:ascii="TH Sarabun New" w:hAnsi="TH Sarabun New"/>
+          <w:b w:val="false"/>
+          <w:sz w:val="32"/>
+          <w:szCs w:val="32"/>
+        </w:rPr>
+        <w:t xml:space="preserve"> </w:t>
+      </w:r>
+      <w:r>
+        <w:rPr>
+          <w:rFonts w:ascii="TH Sarabun New" w:hAnsi="TH Sarabun New" w:eastAsia="TH Sarabun New" w:cs="TH Sarabun New"/>
+          <w:b w:val="false"/>
+          <w:b w:val="false"/>
+          <w:sz w:val="32"/>
+          <w:szCs w:val="32"/>
+        </w:rPr>
+        <w:t>หมายถึง รูปแบบการขับเคลื่อนที่ควบคุมความเร็วของล้อซ้ายและล้อขวาแยกจากกันเพื่อกำหนดทิศทางและการหมุนของหุ่นยนต์</w:t>
+      </w:r>
+    </w:p>
+    <w:p>
+      <w:pPr>
+        <w:pStyle w:val="Normal"/>
+        <w:jc w:val="both"/>
+        <w:rPr>
+          <w:rFonts w:ascii="TH Sarabun New" w:hAnsi="TH Sarabun New" w:cs="TH Sarabun New"/>
+          <w:sz w:val="32"/>
+          <w:szCs w:val="32"/>
+        </w:rPr>
+      </w:pPr>
+      <w:r>
+        <w:rPr>
+          <w:rFonts w:eastAsia="TH Sarabun New" w:cs="TH Sarabun New" w:ascii="TH Sarabun New" w:hAnsi="TH Sarabun New"/>
+          <w:b/>
+          <w:bCs/>
+          <w:sz w:val="32"/>
+          <w:szCs w:val="32"/>
+        </w:rPr>
+        <w:t>Waypoint</w:t>
+      </w:r>
+      <w:r>
+        <w:rPr>
+          <w:rFonts w:eastAsia="TH Sarabun New" w:cs="TH Sarabun New" w:ascii="TH Sarabun New" w:hAnsi="TH Sarabun New"/>
+          <w:b w:val="false"/>
+          <w:sz w:val="32"/>
+          <w:szCs w:val="32"/>
+        </w:rPr>
+        <w:t xml:space="preserve"> </w:t>
+      </w:r>
+      <w:r>
+        <w:rPr>
+          <w:rFonts w:ascii="TH Sarabun New" w:hAnsi="TH Sarabun New" w:eastAsia="TH Sarabun New" w:cs="TH Sarabun New"/>
+          <w:b w:val="false"/>
+          <w:b w:val="false"/>
+          <w:sz w:val="32"/>
+          <w:szCs w:val="32"/>
+        </w:rPr>
+        <w:t>หมายถึง จุดตำแหน่งหรือจุดอ้างอิงที่กำหนดไว้บนเส้นทาง เพื่อใช้ควบคุมลำดับการเดินทางของหุ่นยนต์</w:t>
+      </w:r>
+    </w:p>
+    <w:p>
+      <w:pPr>
+        <w:pStyle w:val="Normal"/>
+        <w:jc w:val="both"/>
+        <w:rPr>
+          <w:rFonts w:ascii="TH Sarabun New" w:hAnsi="TH Sarabun New" w:cs="TH Sarabun New"/>
+          <w:sz w:val="32"/>
+          <w:szCs w:val="32"/>
+        </w:rPr>
+      </w:pPr>
+      <w:r>
+        <w:rPr>
+          <w:rFonts w:eastAsia="TH Sarabun New" w:cs="TH Sarabun New" w:ascii="TH Sarabun New" w:hAnsi="TH Sarabun New"/>
+          <w:b/>
+          <w:bCs/>
+          <w:sz w:val="32"/>
+          <w:szCs w:val="32"/>
+        </w:rPr>
+        <w:t>Encoder</w:t>
+      </w:r>
+      <w:r>
+        <w:rPr>
+          <w:rFonts w:eastAsia="TH Sarabun New" w:cs="TH Sarabun New" w:ascii="TH Sarabun New" w:hAnsi="TH Sarabun New"/>
+          <w:b w:val="false"/>
+          <w:sz w:val="32"/>
+          <w:szCs w:val="32"/>
+        </w:rPr>
+        <w:t xml:space="preserve"> </w:t>
+      </w:r>
+      <w:r>
+        <w:rPr>
+          <w:rFonts w:ascii="TH Sarabun New" w:hAnsi="TH Sarabun New" w:eastAsia="TH Sarabun New" w:cs="TH Sarabun New"/>
+          <w:b w:val="false"/>
+          <w:b w:val="false"/>
+          <w:sz w:val="32"/>
+          <w:szCs w:val="32"/>
+        </w:rPr>
+        <w:t>หมายถึง อุปกรณ์ที่ตรวจวัดการหมุนหรือการเคลื่อนที่ของมอเตอร์และแปลงเป็นสัญญาณสำหรับใช้ประเมินระยะทางหรือความเร็ว</w:t>
+      </w:r>
+    </w:p>
+    <w:p>
+      <w:pPr>
+        <w:pStyle w:val="Normal"/>
+        <w:jc w:val="both"/>
+        <w:rPr>
+          <w:rFonts w:ascii="TH Sarabun New" w:hAnsi="TH Sarabun New" w:cs="TH Sarabun New"/>
+          <w:sz w:val="32"/>
+          <w:szCs w:val="32"/>
+        </w:rPr>
+      </w:pPr>
+      <w:r>
+        <w:rPr>
+          <w:rFonts w:eastAsia="TH Sarabun New" w:cs="TH Sarabun New" w:ascii="TH Sarabun New" w:hAnsi="TH Sarabun New"/>
+          <w:b/>
+          <w:bCs/>
+          <w:sz w:val="32"/>
+          <w:szCs w:val="32"/>
+        </w:rPr>
+        <w:t>LiDAR</w:t>
+      </w:r>
+      <w:r>
+        <w:rPr>
+          <w:rFonts w:eastAsia="TH Sarabun New" w:cs="TH Sarabun New" w:ascii="TH Sarabun New" w:hAnsi="TH Sarabun New"/>
+          <w:b w:val="false"/>
+          <w:sz w:val="32"/>
+          <w:szCs w:val="32"/>
+        </w:rPr>
+        <w:t xml:space="preserve"> </w:t>
+      </w:r>
+      <w:r>
+        <w:rPr>
+          <w:rFonts w:ascii="TH Sarabun New" w:hAnsi="TH Sarabun New" w:eastAsia="TH Sarabun New" w:cs="TH Sarabun New"/>
+          <w:b w:val="false"/>
+          <w:b w:val="false"/>
+          <w:sz w:val="32"/>
+          <w:szCs w:val="32"/>
+        </w:rPr>
+        <w:t>หมายถึง เซนเซอร์ที่ใช้แสงเลเซอร์วัดระยะห่างจากวัตถุ เพื่อรับรู้สภาพแวดล้อมและตรวจจับสิ่งกีดขวาง</w:t>
+      </w:r>
+    </w:p>
+    <w:p>
+      <w:pPr>
+        <w:pStyle w:val="Normal"/>
+        <w:jc w:val="both"/>
+        <w:rPr>
+          <w:rFonts w:ascii="TH Sarabun New" w:hAnsi="TH Sarabun New" w:cs="TH Sarabun New"/>
+          <w:sz w:val="32"/>
+          <w:szCs w:val="32"/>
+        </w:rPr>
+      </w:pPr>
+      <w:r>
+        <w:rPr>
+          <w:rFonts w:eastAsia="TH Sarabun New" w:cs="TH Sarabun New" w:ascii="TH Sarabun New" w:hAnsi="TH Sarabun New"/>
+          <w:b/>
+          <w:bCs/>
+          <w:sz w:val="32"/>
+          <w:szCs w:val="32"/>
+        </w:rPr>
+        <w:t xml:space="preserve">ROS 2 </w:t>
+      </w:r>
+      <w:r>
+        <w:rPr>
+          <w:rFonts w:ascii="TH Sarabun New" w:hAnsi="TH Sarabun New" w:eastAsia="TH Sarabun New" w:cs="TH Sarabun New"/>
+          <w:b/>
+          <w:b/>
+          <w:bCs/>
+          <w:sz w:val="32"/>
+          <w:szCs w:val="32"/>
+        </w:rPr>
+        <w:t>หมาย</w:t>
+      </w:r>
+      <w:r>
+        <w:rPr>
+          <w:rFonts w:ascii="TH Sarabun New" w:hAnsi="TH Sarabun New" w:eastAsia="TH Sarabun New" w:cs="TH Sarabun New"/>
+          <w:b w:val="false"/>
+          <w:b w:val="false"/>
+          <w:sz w:val="32"/>
+          <w:szCs w:val="32"/>
+        </w:rPr>
+        <w:t>ถึง เฟรมเวิร์กสำหรับพัฒนาซอฟต์แวร์หุ่นยนต์และแลกเปลี่ยนข้อมูลระหว่างส่วนต่าง ๆ ของระบบ</w:t>
+      </w:r>
+    </w:p>
+    <w:p>
+      <w:pPr>
+        <w:pStyle w:val="Normal"/>
+        <w:jc w:val="both"/>
+        <w:rPr>
+          <w:rFonts w:ascii="TH Sarabun New" w:hAnsi="TH Sarabun New" w:cs="TH Sarabun New"/>
+          <w:sz w:val="32"/>
+          <w:szCs w:val="32"/>
+        </w:rPr>
+      </w:pPr>
+      <w:r>
+        <w:rPr>
+          <w:rFonts w:eastAsia="TH Sarabun New" w:cs="TH Sarabun New" w:ascii="TH Sarabun New" w:hAnsi="TH Sarabun New"/>
+          <w:b/>
+          <w:bCs/>
+          <w:sz w:val="32"/>
+          <w:szCs w:val="32"/>
+        </w:rPr>
+        <w:t>SLAM</w:t>
+      </w:r>
+      <w:r>
+        <w:rPr>
+          <w:rFonts w:eastAsia="TH Sarabun New" w:cs="TH Sarabun New" w:ascii="TH Sarabun New" w:hAnsi="TH Sarabun New"/>
+          <w:b w:val="false"/>
+          <w:sz w:val="32"/>
+          <w:szCs w:val="32"/>
+        </w:rPr>
+        <w:t xml:space="preserve"> </w:t>
+      </w:r>
+      <w:r>
+        <w:rPr>
+          <w:rFonts w:ascii="TH Sarabun New" w:hAnsi="TH Sarabun New" w:eastAsia="TH Sarabun New" w:cs="TH Sarabun New"/>
+          <w:b w:val="false"/>
+          <w:b w:val="false"/>
+          <w:sz w:val="32"/>
+          <w:szCs w:val="32"/>
+        </w:rPr>
+        <w:t>หมายถึง กระบวนการที่หุ่นยนต์สร้างแผนที่ของพื้นที่พร้อมประมาณตำแหน่งของตนเองขณะเคลื่อนที่</w:t>
+      </w:r>
+    </w:p>
+    <w:p>
+      <w:pPr>
+        <w:pStyle w:val="Normal"/>
+        <w:jc w:val="both"/>
+        <w:rPr>
+          <w:rFonts w:ascii="TH Sarabun New" w:hAnsi="TH Sarabun New" w:cs="TH Sarabun New"/>
+          <w:sz w:val="32"/>
+          <w:szCs w:val="32"/>
+        </w:rPr>
+      </w:pPr>
+      <w:r>
+        <w:rPr>
+          <w:rFonts w:eastAsia="TH Sarabun New" w:cs="TH Sarabun New" w:ascii="TH Sarabun New" w:hAnsi="TH Sarabun New"/>
+          <w:b/>
+          <w:bCs/>
+          <w:sz w:val="32"/>
+          <w:szCs w:val="32"/>
+        </w:rPr>
+        <w:t>POS/Kiosk</w:t>
+      </w:r>
+      <w:r>
+        <w:rPr>
+          <w:rFonts w:eastAsia="TH Sarabun New" w:cs="TH Sarabun New" w:ascii="TH Sarabun New" w:hAnsi="TH Sarabun New"/>
+          <w:b w:val="false"/>
+          <w:sz w:val="32"/>
+          <w:szCs w:val="32"/>
+        </w:rPr>
+        <w:t xml:space="preserve"> </w:t>
+      </w:r>
+      <w:r>
+        <w:rPr>
+          <w:rFonts w:ascii="TH Sarabun New" w:hAnsi="TH Sarabun New" w:eastAsia="TH Sarabun New" w:cs="TH Sarabun New"/>
+          <w:b w:val="false"/>
+          <w:b w:val="false"/>
+          <w:sz w:val="32"/>
+          <w:szCs w:val="32"/>
+        </w:rPr>
+        <w:t>หมายถึง ส่วนติดต่อผู้ใช้สำหรับรับรายการอาหาร เลือกจุดหมาย และจัดการข้อมูลภารกิจของหุ่นยนต์</w:t>
       </w:r>
     </w:p>
     <w:p>
@@ -3858,72 +4039,173 @@
           <w:lang w:val="en-US"/>
         </w:rPr>
       </w:r>
+      <w:r>
+        <w:br w:type="page"/>
+      </w:r>
     </w:p>
     <w:p>
       <w:pPr>
         <w:pStyle w:val="Normal"/>
+        <w:keepNext w:val="true"/>
+        <w:bidi w:val="0"/>
         <w:spacing w:lineRule="auto" w:line="240" w:beforeAutospacing="0" w:before="0" w:afterAutospacing="0" w:after="200"/>
-        <w:jc w:val="center"/>
-        <w:rPr>
-          <w:rFonts w:ascii="TH Sarabun New" w:hAnsi="TH Sarabun New" w:eastAsia="TH SarabunPSK" w:cs="TH Sarabun New"/>
-          <w:b/>
-          <w:bCs/>
-          <w:color w:themeColor="text1" w:val="000000"/>
-          <w:sz w:val="32"/>
-          <w:szCs w:val="32"/>
-          <w:lang w:val="en-US"/>
+        <w:jc w:val="start"/>
+        <w:rPr>
+          <w:rFonts w:ascii="TH Sarabun New" w:hAnsi="TH Sarabun New" w:cs="TH Sarabun New"/>
+          <w:sz w:val="32"/>
+          <w:szCs w:val="32"/>
         </w:rPr>
       </w:pPr>
       <w:r>
         <w:rPr>
-          <w:rFonts w:eastAsia="TH SarabunPSK" w:cs="TH Sarabun New" w:ascii="TH Sarabun New" w:hAnsi="TH Sarabun New"/>
-          <w:b/>
-          <w:bCs/>
-          <w:color w:themeColor="text1" w:val="000000"/>
-          <w:sz w:val="32"/>
-          <w:szCs w:val="32"/>
-          <w:lang w:val="en-US"/>
-        </w:rPr>
+          <w:rFonts w:ascii="TH Sarabun New" w:hAnsi="TH Sarabun New" w:eastAsia="TH Sarabun New" w:cs="TH Sarabun New"/>
+          <w:b/>
+          <w:b/>
+          <w:sz w:val="32"/>
+          <w:szCs w:val="32"/>
+        </w:rPr>
+        <w:t>ข้อมูลอ้างอิง</w:t>
       </w:r>
     </w:p>
     <w:p>
       <w:pPr>
         <w:pStyle w:val="Normal"/>
-        <w:bidi w:val="0"/>
-        <w:spacing w:lineRule="auto" w:line="240" w:beforeAutospacing="0" w:before="0" w:afterAutospacing="0" w:after="200"/>
-        <w:jc w:val="center"/>
-        <w:rPr>
-          <w:rFonts w:ascii="TH Sarabun New" w:hAnsi="TH Sarabun New" w:eastAsia="TH SarabunPSK" w:cs="TH Sarabun New"/>
-          <w:b/>
-          <w:bCs/>
-          <w:color w:themeColor="text1" w:val="000000"/>
-          <w:sz w:val="32"/>
-          <w:szCs w:val="32"/>
-          <w:lang w:val="en-US"/>
+        <w:jc w:val="start"/>
+        <w:rPr>
+          <w:rFonts w:ascii="TH Sarabun New" w:hAnsi="TH Sarabun New" w:cs="TH Sarabun New"/>
+          <w:sz w:val="32"/>
+          <w:szCs w:val="32"/>
         </w:rPr>
       </w:pPr>
       <w:r>
         <w:rPr>
-          <w:rFonts w:eastAsia="TH SarabunPSK" w:cs="TH Sarabun New" w:ascii="TH Sarabun New" w:hAnsi="TH Sarabun New"/>
-          <w:b/>
-          <w:bCs/>
-          <w:color w:themeColor="text1" w:val="000000"/>
-          <w:sz w:val="32"/>
-          <w:szCs w:val="32"/>
-          <w:lang w:val="en-US"/>
-        </w:rPr>
-      </w:r>
-      <w:r>
-        <w:br w:type="page"/>
+          <w:rFonts w:eastAsia="TH Sarabun New" w:cs="TH Sarabun New" w:ascii="TH Sarabun New" w:hAnsi="TH Sarabun New"/>
+          <w:b w:val="false"/>
+          <w:sz w:val="32"/>
+          <w:szCs w:val="32"/>
+        </w:rPr>
+        <w:t xml:space="preserve">[12] </w:t>
+      </w:r>
+      <w:r>
+        <w:rPr>
+          <w:rFonts w:ascii="TH Sarabun New" w:hAnsi="TH Sarabun New" w:eastAsia="TH Sarabun New" w:cs="TH Sarabun New"/>
+          <w:b w:val="false"/>
+          <w:b w:val="false"/>
+          <w:sz w:val="32"/>
+          <w:szCs w:val="32"/>
+        </w:rPr>
+        <w:t>สำนักงานนโยบายและยุทธศาสตร์การค้า</w:t>
+      </w:r>
+      <w:r>
+        <w:rPr>
+          <w:rFonts w:eastAsia="TH Sarabun New" w:cs="TH Sarabun New" w:ascii="TH Sarabun New" w:hAnsi="TH Sarabun New"/>
+          <w:b w:val="false"/>
+          <w:sz w:val="32"/>
+          <w:szCs w:val="32"/>
+        </w:rPr>
+        <w:t>, “</w:t>
+      </w:r>
+      <w:r>
+        <w:rPr>
+          <w:rFonts w:ascii="TH Sarabun New" w:hAnsi="TH Sarabun New" w:eastAsia="TH Sarabun New" w:cs="TH Sarabun New"/>
+          <w:b w:val="false"/>
+          <w:b w:val="false"/>
+          <w:sz w:val="32"/>
+          <w:szCs w:val="32"/>
+        </w:rPr>
+        <w:t>สนค</w:t>
+      </w:r>
+      <w:r>
+        <w:rPr>
+          <w:rFonts w:eastAsia="TH Sarabun New" w:cs="TH Sarabun New" w:ascii="TH Sarabun New" w:hAnsi="TH Sarabun New"/>
+          <w:b w:val="false"/>
+          <w:sz w:val="32"/>
+          <w:szCs w:val="32"/>
+        </w:rPr>
+        <w:t xml:space="preserve">. </w:t>
+      </w:r>
+      <w:r>
+        <w:rPr>
+          <w:rFonts w:ascii="TH Sarabun New" w:hAnsi="TH Sarabun New" w:eastAsia="TH Sarabun New" w:cs="TH Sarabun New"/>
+          <w:b w:val="false"/>
+          <w:b w:val="false"/>
+          <w:sz w:val="32"/>
+          <w:szCs w:val="32"/>
+        </w:rPr>
+        <w:t xml:space="preserve">เผยข้อมูลการใช้หุ่นยนต์บริการ </w:t>
+      </w:r>
+      <w:r>
+        <w:rPr>
+          <w:rFonts w:eastAsia="TH Sarabun New" w:cs="TH Sarabun New" w:ascii="TH Sarabun New" w:hAnsi="TH Sarabun New"/>
+          <w:b w:val="false"/>
+          <w:sz w:val="32"/>
+          <w:szCs w:val="32"/>
+        </w:rPr>
+        <w:t xml:space="preserve">(Service Robot),” </w:t>
+      </w:r>
+      <w:r>
+        <w:rPr>
+          <w:rFonts w:ascii="TH Sarabun New" w:hAnsi="TH Sarabun New" w:eastAsia="TH Sarabun New" w:cs="TH Sarabun New"/>
+          <w:b w:val="false"/>
+          <w:b w:val="false"/>
+          <w:sz w:val="32"/>
+          <w:szCs w:val="32"/>
+        </w:rPr>
+        <w:t>กระทรวงพาณิชย์</w:t>
+      </w:r>
+      <w:r>
+        <w:rPr>
+          <w:rFonts w:eastAsia="TH Sarabun New" w:cs="TH Sarabun New" w:ascii="TH Sarabun New" w:hAnsi="TH Sarabun New"/>
+          <w:b w:val="false"/>
+          <w:sz w:val="32"/>
+          <w:szCs w:val="32"/>
+        </w:rPr>
+        <w:t>. [</w:t>
+      </w:r>
+      <w:r>
+        <w:rPr>
+          <w:rFonts w:ascii="TH Sarabun New" w:hAnsi="TH Sarabun New" w:eastAsia="TH Sarabun New" w:cs="TH Sarabun New"/>
+          <w:b w:val="false"/>
+          <w:b w:val="false"/>
+          <w:sz w:val="32"/>
+          <w:szCs w:val="32"/>
+        </w:rPr>
+        <w:t>ออนไลน์</w:t>
+      </w:r>
+      <w:r>
+        <w:rPr>
+          <w:rFonts w:eastAsia="TH Sarabun New" w:cs="TH Sarabun New" w:ascii="TH Sarabun New" w:hAnsi="TH Sarabun New"/>
+          <w:b w:val="false"/>
+          <w:sz w:val="32"/>
+          <w:szCs w:val="32"/>
+        </w:rPr>
+        <w:t xml:space="preserve">]. </w:t>
+      </w:r>
+      <w:r>
+        <w:rPr>
+          <w:rFonts w:ascii="TH Sarabun New" w:hAnsi="TH Sarabun New" w:eastAsia="TH Sarabun New" w:cs="TH Sarabun New"/>
+          <w:b w:val="false"/>
+          <w:b w:val="false"/>
+          <w:sz w:val="32"/>
+          <w:szCs w:val="32"/>
+        </w:rPr>
+        <w:t>เข้าถึงได้จาก</w:t>
+      </w:r>
+      <w:r>
+        <w:rPr>
+          <w:rFonts w:eastAsia="TH Sarabun New" w:cs="TH Sarabun New" w:ascii="TH Sarabun New" w:hAnsi="TH Sarabun New"/>
+          <w:b w:val="false"/>
+          <w:sz w:val="32"/>
+          <w:szCs w:val="32"/>
+        </w:rPr>
+        <w:t>: https://www.tpso.go.th/news/2403-0000000005</w:t>
       </w:r>
     </w:p>
     <w:p>
       <w:pPr>
-        <w:pStyle w:val="Heading1"/>
-        <w:keepNext w:val="true"/>
-        <w:bidi w:val="0"/>
-        <w:spacing w:lineRule="auto" w:line="240" w:beforeAutospacing="0" w:before="0" w:afterAutospacing="0" w:after="200"/>
-        <w:jc w:val="center"/>
+        <w:pStyle w:val="Normal"/>
+        <w:spacing w:before="0" w:after="160"/>
+        <w:jc w:val="start"/>
         <w:rPr>
           <w:rFonts w:ascii="TH Sarabun New" w:hAnsi="TH Sarabun New" w:cs="TH Sarabun New"/>
           <w:sz w:val="32"/>
@@ -3932,12 +4214,50 @@
       </w:pPr>
       <w:r>
         <w:rPr>
-          <w:rFonts w:eastAsia="TH SarabunPSK" w:cs="TH Sarabun New" w:ascii="TH Sarabun New" w:hAnsi="TH Sarabun New"/>
-          <w:b/>
-          <w:bCs/>
-          <w:sz w:val="32"/>
-          <w:szCs w:val="32"/>
-        </w:rPr>
+          <w:rFonts w:eastAsia="TH Sarabun New" w:cs="TH Sarabun New" w:ascii="TH Sarabun New" w:hAnsi="TH Sarabun New"/>
+          <w:b w:val="false"/>
+          <w:sz w:val="32"/>
+          <w:szCs w:val="32"/>
+        </w:rPr>
+        <w:t>[13] Krungsri Research, “Industry Outlook: Food and Beverage Services,” Bank of Ayudhya. [</w:t>
+      </w:r>
+      <w:r>
+        <w:rPr>
+          <w:rFonts w:ascii="TH Sarabun New" w:hAnsi="TH Sarabun New" w:eastAsia="TH Sarabun New" w:cs="TH Sarabun New"/>
+          <w:b w:val="false"/>
+          <w:b w:val="false"/>
+          <w:sz w:val="32"/>
+          <w:szCs w:val="32"/>
+        </w:rPr>
+        <w:t>ออนไลน์</w:t>
+      </w:r>
+      <w:r>
+        <w:rPr>
+          <w:rFonts w:eastAsia="TH Sarabun New" w:cs="TH Sarabun New" w:ascii="TH Sarabun New" w:hAnsi="TH Sarabun New"/>
+          <w:b w:val="false"/>
+          <w:sz w:val="32"/>
+          <w:szCs w:val="32"/>
+        </w:rPr>
+        <w:t xml:space="preserve">]. </w:t>
+      </w:r>
+      <w:r>
+        <w:rPr>
+          <w:rFonts w:ascii="TH Sarabun New" w:hAnsi="TH Sarabun New" w:eastAsia="TH Sarabun New" w:cs="TH Sarabun New"/>
+          <w:b w:val="false"/>
+          <w:b w:val="false"/>
+          <w:sz w:val="32"/>
+          <w:szCs w:val="32"/>
+        </w:rPr>
+        <w:t>เข้าถึงได้จาก</w:t>
+      </w:r>
+      <w:r>
+        <w:rPr>
+          <w:rFonts w:eastAsia="TH Sarabun New" w:cs="TH Sarabun New" w:ascii="TH Sarabun New" w:hAnsi="TH Sarabun New"/>
+          <w:b w:val="false"/>
+          <w:sz w:val="32"/>
+          <w:szCs w:val="32"/>
+        </w:rPr>
+        <w:t>: https://www.krungsri.com/en/research/industry/industry-outlook/services/food-beverages/io/io-food-beverage-restaurant-2026</w:t>
       </w:r>
     </w:p>
     <w:sectPr>

</xml_diff>